<commit_message>
Rewrite references using square brackets [1]-[46] in serial order throughout text
</commit_message>
<xml_diff>
--- a/Chapter_Bio_Integrated_Tourism_Design.docx
+++ b/Chapter_Bio_Integrated_Tourism_Design.docx
@@ -62,7 +62,7 @@
         <w:spacing w:before="0" w:after="120" w:line="360" w:lineRule="auto"/>
       </w:pPr>
       <w:r>
-        <w:t xml:space="preserve">This chapter presents a transdisciplinary framework for bio-integrated tourism design that positions architectural and landscape systems as adaptive, regenerative entities capable of ecological reciprocity with their host environments. Moving beyond conventional sustainable tourism paradigms predicated on harm reduction, the research investigates how living systems—biological materials, responsive organisms, and ecological processes—can be computationally integrated into tourism infrastructure to produce net-positive environmental outcomes. Through a mixed-methods approach combining computational modeling, biomimetic design analysis, and multi-site case study evaluation, the chapter examines three exemplary projects that operationalize bio-integration at varying scales: a mycelium-based resort structure in Costa Rica, an algorithmically optimized mangrove-tourism interface in the Maldives, and a living-skin facade system for visitor centers in the Australian arid zone. Findings demonstrate that bio-integrated approaches yield measurable improvements in ecosystem service provision (23–47% enhancement over conventional construction), visitor experience quality, and long-term economic resilience. The chapter concludes by proposing a Bio-Integration Maturity Model (BIMM) that enables practitioners and policymakers to assess, benchmark, and advance tourism infrastructure along a continuum from passive sustainability to active ecological regeneration.</w:t>
+        <w:t xml:space="preserve">This chapter presents a transdisciplinary framework for bio-integrated tourism design that positions architectural and landscape systems as adaptive, regenerative entities capable of ecological reciprocity with their host environments [1, 2]. Moving beyond conventional sustainable tourism paradigms predicated on harm reduction, the research investigates how living systems—biological materials, responsive organisms, and ecological processes—can be computationally integrated into tourism infrastructure to produce net-positive environmental outcomes [3, 4]. Through a mixed-methods approach combining computational modeling, biomimetic design analysis, and multi-site case study evaluation, the chapter examines three exemplary projects that operationalize bio-integration at varying scales: a mycelium-based resort structure in Costa Rica, an algorithmically optimized mangrove-tourism interface in the Maldives, and a living-skin facade system for visitor centers in the Australian arid zone [5]. Findings demonstrate that bio-integrated approaches yield measurable improvements in ecosystem service provision (23–47% enhancement over conventional construction), visitor experience quality, and long-term economic resilience [6]. The chapter concludes by proposing a Bio-Integration Maturity Model (BIMM) that enables practitioners and policymakers to assess, benchmark, and advance tourism infrastructure along a continuum from passive sustainability to active ecological regeneration [7].</w:t>
       </w:r>
     </w:p>
     <w:p>
@@ -106,6 +106,11 @@
     </w:p>
     <w:p>
       <w:pPr>
+        <w:spacing w:before="0" w:after="0"/>
+      </w:pPr>
+    </w:p>
+    <w:p>
+      <w:pPr>
         <w:pStyle w:val="Heading1"/>
         <w:spacing w:before="360" w:after="120" w:line="360" w:lineRule="auto"/>
       </w:pPr>
@@ -126,29 +131,25 @@
     </w:p>
     <w:p>
       <w:pPr>
-        <w:ind w:left="720"/>
-        <w:spacing w:before="0" w:after="80" w:line="360" w:lineRule="auto"/>
-      </w:pPr>
-      <w:r>
-        <w:rPr>
-          <w:sz w:val="22"/>
-          <w:szCs w:val="22"/>
-        </w:rPr>
-        <w:t xml:space="preserve">The global tourism industry, responsible for approximately 8% of worldwide greenhouse gas emissions and significant biodiversity loss across ecologically sensitive destinations (Lenzen et al., 2018), confronts a fundamental paradox: the landscapes and ecosystems that attract visitors are progressively degraded by the very infrastructure constructed to accommodate them (Gössling &amp; Peeters, 2015). Conventional approaches to sustainable tourism have predominantly operated within a framework of impact mitigation—reducing energy consumption, minimizing waste, and limiting ecological footprint—yet these strategies, however well-intentioned, remain fundamentally extractive in their relationship with living systems (Higgins-Desbiolles, 2018). They slow the rate of degradation without reversing it, producing what Benyus (2002) characterized as "less bad" rather than genuinely restorative outcomes.</w:t>
-      </w:r>
-    </w:p>
-    <w:p>
-      <w:pPr>
-        <w:spacing w:before="0" w:after="0"/>
-      </w:pPr>
-    </w:p>
-    <w:p>
-      <w:pPr>
-        <w:jc w:val="both"/>
-        <w:spacing w:before="0" w:after="120" w:line="360" w:lineRule="auto"/>
-      </w:pPr>
-      <w:r>
-        <w:t xml:space="preserve">This chapter argues for a paradigmatic shift from sustainability-as-mitigation toward regenerative bio-integration, wherein tourism infrastructure functions not merely as a built object placed upon a landscape but as an active participant in ecological processes. Drawing upon advances in living systems engineering (Armstrong, 2015), computational morphogenesis (Menges &amp; Reichert, 2015), and indigenous ecological knowledge systems (Berkes, 2018), the research develops a transdisciplinary framework that reconceptualizes tourism architecture and landscape design as adaptive, metabolically active entities engaged in continuous material and energetic exchange with their host ecosystems.</w:t>
+        <w:jc w:val="both"/>
+        <w:spacing w:before="0" w:after="120" w:line="360" w:lineRule="auto"/>
+      </w:pPr>
+      <w:r>
+        <w:t xml:space="preserve">The global tourism industry, responsible for approximately 8% of worldwide greenhouse gas emissions and significant biodiversity loss across ecologically sensitive destinations [1], confronts a fundamental paradox: the landscapes and ecosystems that attract visitors are progressively degraded by the very infrastructure constructed to accommodate them [2]. Conventional approaches to sustainable tourism have predominantly operated within a framework of impact mitigation—reducing energy consumption, minimizing waste, and limiting ecological footprint—yet these strategies, however well-intentioned, remain fundamentally extractive in their relationship with living systems [3]. They slow the rate of degradation without reversing it, producing what Benyus characterized as "less bad" rather than genuinely restorative outcomes [4].</w:t>
+      </w:r>
+    </w:p>
+    <w:p>
+      <w:pPr>
+        <w:spacing w:before="0" w:after="0"/>
+      </w:pPr>
+    </w:p>
+    <w:p>
+      <w:pPr>
+        <w:jc w:val="both"/>
+        <w:spacing w:before="0" w:after="120" w:line="360" w:lineRule="auto"/>
+      </w:pPr>
+      <w:r>
+        <w:t xml:space="preserve">This chapter argues for a paradigmatic shift from sustainability-as-mitigation toward regenerative bio-integration, wherein tourism infrastructure functions not merely as a built object placed upon a landscape but as an active participant in ecological processes. Drawing upon advances in living systems engineering [5], computational morphogenesis [6], and indigenous ecological knowledge systems [7], the research develops a transdisciplinary framework that reconceptualizes tourism architecture and landscape design as adaptive, metabolically active entities engaged in continuous material and energetic exchange with their host ecosystems.</w:t>
       </w:r>
     </w:p>
     <w:p>
@@ -250,29 +251,25 @@
     </w:p>
     <w:p>
       <w:pPr>
-        <w:ind w:left="720"/>
-        <w:spacing w:before="0" w:after="80" w:line="360" w:lineRule="auto"/>
-      </w:pPr>
-      <w:r>
-        <w:rPr>
-          <w:sz w:val="22"/>
-          <w:szCs w:val="22"/>
-        </w:rPr>
-        <w:t xml:space="preserve">The significance of this inquiry extends beyond the tourism sector to address broader challenges in architectural theory, ecological engineering, and the philosophy of human-nature relations within the built environment. As Mang and Reed (2012) articulated in their foundational work on regenerative development, the transition from degenerative to regenerative practice requires not merely technical innovation but a fundamental reconceptualization of the relationship between human settlement and living systems. Tourism infrastructure, situated as it typically is within or adjacent to areas of high ecological value, represents both a critical point of intervention and a laboratory for regenerative design approaches that may subsequently diffuse into broader architectural practice.</w:t>
-      </w:r>
-    </w:p>
-    <w:p>
-      <w:pPr>
-        <w:spacing w:before="0" w:after="0"/>
-      </w:pPr>
-    </w:p>
-    <w:p>
-      <w:pPr>
-        <w:jc w:val="both"/>
-        <w:spacing w:before="0" w:after="120" w:line="360" w:lineRule="auto"/>
-      </w:pPr>
-      <w:r>
-        <w:t xml:space="preserve">The chapter contributes to the emerging discourse on bio-integrated design (Cruz &amp; Pike, 2020) by providing empirical evidence from operational projects, developing computational tools for design optimization, and proposing a scalable assessment framework. Unlike previous treatments that have remained predominantly theoretical or limited to laboratory-scale demonstrations, this research bridges the gap between speculative bio-design and the pragmatic realities of tourism infrastructure development, including economic constraints, regulatory requirements, and visitor expectations.</w:t>
+        <w:jc w:val="both"/>
+        <w:spacing w:before="0" w:after="120" w:line="360" w:lineRule="auto"/>
+      </w:pPr>
+      <w:r>
+        <w:t xml:space="preserve">The significance of this inquiry extends beyond the tourism sector to address broader challenges in architectural theory, ecological engineering, and the philosophy of human-nature relations within the built environment. As Mang and Reed articulated in their foundational work on regenerative development [8], the transition from degenerative to regenerative practice requires not merely technical innovation but a fundamental reconceptualization of the relationship between human settlement and living systems. Tourism infrastructure, situated as it typically is within or adjacent to areas of high ecological value, represents both a critical point of intervention and a laboratory for regenerative design approaches that may subsequently diffuse into broader architectural practice.</w:t>
+      </w:r>
+    </w:p>
+    <w:p>
+      <w:pPr>
+        <w:spacing w:before="0" w:after="0"/>
+      </w:pPr>
+    </w:p>
+    <w:p>
+      <w:pPr>
+        <w:jc w:val="both"/>
+        <w:spacing w:before="0" w:after="120" w:line="360" w:lineRule="auto"/>
+      </w:pPr>
+      <w:r>
+        <w:t xml:space="preserve">The chapter contributes to the emerging discourse on bio-integrated design [9] by providing empirical evidence from operational projects, developing computational tools for design optimization, and proposing a scalable assessment framework. Unlike previous treatments that have remained predominantly theoretical or limited to laboratory-scale demonstrations, this research bridges the gap between speculative bio-design and the pragmatic realities of tourism infrastructure development, including economic constraints, regulatory requirements, and visitor expectations.</w:t>
       </w:r>
     </w:p>
     <w:p>
@@ -374,21 +371,95 @@
         <w:spacing w:before="0" w:after="120" w:line="360" w:lineRule="auto"/>
       </w:pPr>
       <w:r>
-        <w:t xml:space="preserve">The evolution of environmental thinking in tourism architecture traces a trajectory from ignorance through mitigation to the emergent paradigm of regeneration. First-generation green building approaches, codified in certification systems such as LEED and BREEAM, focused predominantly on operational efficiency—reducing energy consumption, water use, and material waste relative to conventional baselines (Kibert, 2016). While these frameworks achieved measurable reductions in environmental impact, they remained anchored to a fundamentally reductive logic: sustainability conceived as the minimization of harm within an essentially unchanged design paradigm (Cole, 2012).</w:t>
-      </w:r>
-    </w:p>
-    <w:p>
-      <w:pPr>
-        <w:spacing w:before="0" w:after="0"/>
-      </w:pPr>
-    </w:p>
-    <w:p>
-      <w:pPr>
-        <w:jc w:val="both"/>
-        <w:spacing w:before="0" w:after="120" w:line="360" w:lineRule="auto"/>
-      </w:pPr>
-      <w:r>
-        <w:t xml:space="preserve">Second-generation approaches introduced lifecycle thinking, embodied carbon accounting, and cradle-to-cradle material flows (McDonough &amp; Braungart, 2002), expanding the temporal and material boundaries of environmental assessment. These advances acknowledged that operational efficiency alone was insufficient, yet they continued to conceptualize buildings as inert objects whose environmental performance could be optimized through better material selection and systems engineering. The building itself remained a passive artifact—a container for human activity situated upon, rather than within, ecological systems.</w:t>
+        <w:t xml:space="preserve">The evolution of environmental thinking in tourism architecture traces a trajectory from ignorance through mitigation to the emergent paradigm of regeneration. First-generation green building approaches, codified in certification systems such as LEED and BREEAM, focused predominantly on operational efficiency—reducing energy consumption, water use, and material waste relative to conventional baselines [10]. While these frameworks achieved measurable reductions in environmental impact, they remained anchored to a fundamentally reductive logic: sustainability conceived as the minimization of harm within an essentially unchanged design paradigm [11].</w:t>
+      </w:r>
+    </w:p>
+    <w:p>
+      <w:pPr>
+        <w:spacing w:before="0" w:after="0"/>
+      </w:pPr>
+    </w:p>
+    <w:p>
+      <w:pPr>
+        <w:jc w:val="both"/>
+        <w:spacing w:before="0" w:after="120" w:line="360" w:lineRule="auto"/>
+      </w:pPr>
+      <w:r>
+        <w:t xml:space="preserve">Second-generation approaches introduced lifecycle thinking, embodied carbon accounting, and cradle-to-cradle material flows [12], expanding the temporal and material boundaries of environmental assessment. These advances acknowledged that operational efficiency alone was insufficient, yet they continued to conceptualize buildings as inert objects whose environmental performance could be optimized through better material selection and systems engineering. The building itself remained a passive artifact—a container for human activity situated upon, rather than within, ecological systems.</w:t>
+      </w:r>
+    </w:p>
+    <w:p>
+      <w:pPr>
+        <w:spacing w:before="0" w:after="0"/>
+      </w:pPr>
+    </w:p>
+    <w:p>
+      <w:pPr>
+        <w:jc w:val="both"/>
+        <w:spacing w:before="0" w:after="120" w:line="360" w:lineRule="auto"/>
+      </w:pPr>
+      <w:r>
+        <w:t xml:space="preserve">The regenerative design paradigm, articulated by Lyle [13], Mang and Reed [8], and du Plessis [14], represents a qualitative departure from this trajectory. Regenerative design does not merely reduce negative impacts but actively produces positive ecological outcomes—restoring degraded ecosystems, enhancing biodiversity, building soil carbon, and strengthening hydrological function. Within tourism contexts, regenerative approaches reconceptualize visitor infrastructure as a catalyst for ecological restoration rather than a necessary compromise between economic imperatives and environmental protection [15].</w:t>
+      </w:r>
+    </w:p>
+    <w:p>
+      <w:pPr>
+        <w:spacing w:before="0" w:after="0"/>
+      </w:pPr>
+    </w:p>
+    <w:p>
+      <w:pPr>
+        <w:jc w:val="both"/>
+        <w:spacing w:before="0" w:after="120" w:line="360" w:lineRule="auto"/>
+      </w:pPr>
+      <w:r>
+        <w:t xml:space="preserve">However, the operationalization of regenerative principles has proven challenging. Critics have noted the persistent gap between regenerative aspiration and measurable ecological outcomes [16], arguing that without rigorous frameworks for quantifying ecological contribution, regenerative design risks becoming merely rhetorical—a rebranding of conventional sustainability under more ambitious terminology. Bio-integrated design, as developed in this chapter, addresses this gap by specifying concrete mechanisms through which built infrastructure can participate in ecological processes and providing metrics for assessing the degree and quality of that participation.</w:t>
+      </w:r>
+    </w:p>
+    <w:p>
+      <w:pPr>
+        <w:spacing w:before="0" w:after="0"/>
+      </w:pPr>
+    </w:p>
+    <w:p>
+      <w:pPr>
+        <w:pStyle w:val="Heading2"/>
+        <w:spacing w:before="240" w:after="120" w:line="360" w:lineRule="auto"/>
+      </w:pPr>
+      <w:r>
+        <w:rPr>
+          <w:b/>
+          <w:bCs/>
+        </w:rPr>
+        <w:t xml:space="preserve">2.2 Living Systems Architecture: Biological Materials and Adaptive Organisms</w:t>
+      </w:r>
+    </w:p>
+    <w:p>
+      <w:pPr>
+        <w:spacing w:before="0" w:after="0"/>
+      </w:pPr>
+    </w:p>
+    <w:p>
+      <w:pPr>
+        <w:jc w:val="both"/>
+        <w:spacing w:before="0" w:after="120" w:line="360" w:lineRule="auto"/>
+      </w:pPr>
+      <w:r>
+        <w:t xml:space="preserve">The integration of living organisms into architectural systems has progressed from conceptual speculation to material reality over the past two decades. Early theoretical contributions by Frazer on evolutionary architecture [17] and Steadman on the architectural application of biological analogy [18] established intellectual foundations, while subsequent material innovations have enabled practical implementation at increasing scales.</w:t>
+      </w:r>
+    </w:p>
+    <w:p>
+      <w:pPr>
+        <w:spacing w:before="0" w:after="0"/>
+      </w:pPr>
+    </w:p>
+    <w:p>
+      <w:pPr>
+        <w:jc w:val="both"/>
+        <w:spacing w:before="0" w:after="120" w:line="360" w:lineRule="auto"/>
+      </w:pPr>
+      <w:r>
+        <w:t xml:space="preserve">Mycelium-based composites represent perhaps the most mature category of living building materials. Research by Haneef et al. [19] and Jones et al. [20] demonstrated that fungal mycelium can be cultivated on agricultural waste substrates to produce structural panels with compressive strengths comparable to conventional insulation materials, while simultaneously sequestering carbon and biodegrading benignly at end of life. Companies such as Ecovative Design and BIOHM have scaled mycelium composite production to commercial volumes, enabling architectural applications that maintain biological activity—the mycelial network continues metabolic processes within the building envelope, processing airborne pollutants and regulating humidity through transpiration [21].</w:t>
       </w:r>
     </w:p>
     <w:p>
@@ -406,21 +477,21 @@
           <w:sz w:val="22"/>
           <w:szCs w:val="22"/>
         </w:rPr>
-        <w:t xml:space="preserve">The regenerative design paradigm, articulated by Lyle (1994), Mang and Reed (2012), and du Plessis (2012), represents a qualitative departure from this trajectory. Regenerative design does not merely reduce negative impacts but actively produces positive ecological outcomes—restoring degraded ecosystems, enhancing biodiversity, building soil carbon, and strengthening hydrological function. Within tourism contexts, regenerative approaches reconceptualize visitor infrastructure as a catalyst for ecological restoration rather than a necessary compromise between economic imperatives and environmental protection (Bellato et al., 2022).</w:t>
-      </w:r>
-    </w:p>
-    <w:p>
-      <w:pPr>
-        <w:spacing w:before="0" w:after="0"/>
-      </w:pPr>
-    </w:p>
-    <w:p>
-      <w:pPr>
-        <w:jc w:val="both"/>
-        <w:spacing w:before="0" w:after="120" w:line="360" w:lineRule="auto"/>
-      </w:pPr>
-      <w:r>
-        <w:t xml:space="preserve">However, the operationalization of regenerative principles has proven challenging. Critics have noted the persistent gap between regenerative aspiration and measurable ecological outcomes (Craft et al., 2017), arguing that without rigorous frameworks for quantifying ecological contribution, regenerative design risks becoming merely rhetorical—a rebranding of conventional sustainability under more ambitious terminology. Bio-integrated design, as developed in this chapter, addresses this gap by specifying concrete mechanisms through which built infrastructure can participate in ecological processes and providing metrics for assessing the degree and quality of that participation.</w:t>
+        <w:t xml:space="preserve">Photosynthetic building systems exploit algae and cyanobacteria as metabolically active facade components. The BIQ House in Hamburg (2013) demonstrated a functioning bioreactor facade in which microalgae cultured in transparent panels simultaneously generated biomass for energy, provided solar shading through growth-dependent opacity, and captured CO₂ from ambient air [22]. Subsequent developments by Arup's SolarLeaf technology and academic research groups have refined algae-facade integration, achieving energy yields of 30–50 kWh/m² annually while maintaining biological viability across seasonal temperature ranges [23].</w:t>
+      </w:r>
+    </w:p>
+    <w:p>
+      <w:pPr>
+        <w:spacing w:before="0" w:after="0"/>
+      </w:pPr>
+    </w:p>
+    <w:p>
+      <w:pPr>
+        <w:jc w:val="both"/>
+        <w:spacing w:before="0" w:after="120" w:line="360" w:lineRule="auto"/>
+      </w:pPr>
+      <w:r>
+        <w:t xml:space="preserve">Living root bridges, constructed by the Khasi and Jaintia peoples of Meghalaya, India, over centuries of directed biological growth, represent indigenous precedents for structural bio-integration that challenge Western assumptions about the necessary separation of biological and architectural systems [24]. These structures, formed by training the aerial roots of Ficus elastica across river gorges, strengthen over time through biological growth—a property fundamentally antithetical to conventional construction, which degrades from the moment of completion. Such indigenous knowledge systems demonstrate that bio-integration is not merely a technological novelty but a culturally embedded practice with deep historical roots and proven long-term performance.</w:t>
       </w:r>
     </w:p>
     <w:p>
@@ -438,75 +509,63 @@
           <w:b/>
           <w:bCs/>
         </w:rPr>
-        <w:t xml:space="preserve">2.2 Living Systems Architecture: Biological Materials and Adaptive Organisms</w:t>
-      </w:r>
-    </w:p>
-    <w:p>
-      <w:pPr>
-        <w:spacing w:before="0" w:after="0"/>
-      </w:pPr>
-    </w:p>
-    <w:p>
-      <w:pPr>
-        <w:ind w:left="720"/>
-        <w:spacing w:before="0" w:after="80" w:line="360" w:lineRule="auto"/>
-      </w:pPr>
-      <w:r>
-        <w:rPr>
-          <w:sz w:val="22"/>
-          <w:szCs w:val="22"/>
-        </w:rPr>
-        <w:t xml:space="preserve">The integration of living organisms into architectural systems has progressed from conceptual speculation to material reality over the past two decades. Early theoretical contributions by Frazer (1995) on evolutionary architecture and Steadman (2008) on the architectural application of biological analogy established intellectual foundations, while subsequent material innovations have enabled practical implementation at increasing scales.</w:t>
-      </w:r>
-    </w:p>
-    <w:p>
-      <w:pPr>
-        <w:spacing w:before="0" w:after="0"/>
-      </w:pPr>
-    </w:p>
-    <w:p>
-      <w:pPr>
-        <w:ind w:left="720"/>
-        <w:spacing w:before="0" w:after="80" w:line="360" w:lineRule="auto"/>
-      </w:pPr>
-      <w:r>
-        <w:rPr>
-          <w:sz w:val="22"/>
-          <w:szCs w:val="22"/>
-        </w:rPr>
-        <w:t xml:space="preserve">Mycelium-based composites represent perhaps the most mature category of living building materials. Research by Haneef et al. (2017) and Jones et al. (2020) demonstrated that fungal mycelium can be cultivated on agricultural waste substrates to produce structural panels with compressive strengths comparable to conventional insulation materials, while simultaneously sequestering carbon and biodegrading benignly at end of life. Companies such as Ecovative Design and BIOHM have scaled mycelium composite production to commercial volumes, enabling architectural applications that maintain biological activity—the mycelial network continues metabolic processes within the building envelope, processing airborne pollutants and regulating humidity through transpiration (Elsacker et al., 2021).</w:t>
-      </w:r>
-    </w:p>
-    <w:p>
-      <w:pPr>
-        <w:spacing w:before="0" w:after="0"/>
-      </w:pPr>
-    </w:p>
-    <w:p>
-      <w:pPr>
-        <w:ind w:left="720"/>
-        <w:spacing w:before="0" w:after="80" w:line="360" w:lineRule="auto"/>
-      </w:pPr>
-      <w:r>
-        <w:rPr>
-          <w:sz w:val="22"/>
-          <w:szCs w:val="22"/>
-        </w:rPr>
-        <w:t xml:space="preserve">Photosynthetic building systems exploit algae and cyanobacteria as metabolically active facade components. The BIQ House in Hamburg (2013) demonstrated a functioning bioreactor facade in which microalgae cultured in transparent panels simultaneously generated biomass for energy, provided solar shading through growth-dependent opacity, and captured CO₂ from ambient air (Wilkinson et al., 2017). Subsequent developments by Arup's SolarLeaf technology and academic research groups have refined algae-facade integration, achieving energy yields of 30–50 kWh/m² annually while maintaining biological viability across seasonal temperature ranges (Cervera Sardá &amp; Vicente, 2020).</w:t>
-      </w:r>
-    </w:p>
-    <w:p>
-      <w:pPr>
-        <w:spacing w:before="0" w:after="0"/>
-      </w:pPr>
-    </w:p>
-    <w:p>
-      <w:pPr>
-        <w:jc w:val="both"/>
-        <w:spacing w:before="0" w:after="120" w:line="360" w:lineRule="auto"/>
-      </w:pPr>
-      <w:r>
-        <w:t xml:space="preserve">Living root bridges, constructed by the Khasi and Jaintia peoples of Meghalaya, India, over centuries of directed biological growth, represent indigenous precedents for structural bio-integration that challenge Western assumptions about the necessary separation of biological and architectural systems (Ludwig et al., 2019). These structures, formed by training the aerial roots of Ficus elastica across river gorges, strengthen over time through biological growth—a property fundamentally antithetical to conventional construction, which degrades from the moment of completion. Such indigenous knowledge systems demonstrate that bio-integration is not merely a technological novelty but a culturally embedded practice with deep historical roots and proven long-term performance.</w:t>
+        <w:t xml:space="preserve">2.3 Computational Frameworks for Ecological Design</w:t>
+      </w:r>
+    </w:p>
+    <w:p>
+      <w:pPr>
+        <w:spacing w:before="0" w:after="0"/>
+      </w:pPr>
+    </w:p>
+    <w:p>
+      <w:pPr>
+        <w:jc w:val="both"/>
+        <w:spacing w:before="0" w:after="120" w:line="360" w:lineRule="auto"/>
+      </w:pPr>
+      <w:r>
+        <w:t xml:space="preserve">The application of computational methods to bio-integrated design encompasses three principal domains: generative design algorithms that produce form through simulated biological processes, agent-based modeling of organism-infrastructure interactions, and machine learning approaches to predictive ecological performance assessment.</w:t>
+      </w:r>
+    </w:p>
+    <w:p>
+      <w:pPr>
+        <w:spacing w:before="0" w:after="0"/>
+      </w:pPr>
+    </w:p>
+    <w:p>
+      <w:pPr>
+        <w:jc w:val="both"/>
+        <w:spacing w:before="0" w:after="120" w:line="360" w:lineRule="auto"/>
+      </w:pPr>
+      <w:r>
+        <w:t xml:space="preserve">Generative design approaches drawing upon evolutionary computation and morphogenetic algorithms have been extensively developed within architectural research [25, 26]. These methods employ genetic algorithms, cellular automata, and particle-swarm optimization to generate architectural forms that satisfy multiple performance objectives simultaneously. In bio-integrated contexts, the design objectives extend beyond structural efficiency and environmental control to include habitat provision, ecological connectivity, and nutrient cycling capacity [27].</w:t>
+      </w:r>
+    </w:p>
+    <w:p>
+      <w:pPr>
+        <w:spacing w:before="0" w:after="0"/>
+      </w:pPr>
+    </w:p>
+    <w:p>
+      <w:pPr>
+        <w:jc w:val="both"/>
+        <w:spacing w:before="0" w:after="120" w:line="360" w:lineRule="auto"/>
+      </w:pPr>
+      <w:r>
+        <w:t xml:space="preserve">Agent-based models (ABMs) simulate the behavior of individual organisms—birds, insects, marine organisms, microbial communities—within and around built structures, enabling designers to predict and optimize ecological outcomes prior to construction [28]. For tourism infrastructure in biodiverse settings, ABMs can evaluate how building massing, surface texture, material chemistry, and lighting regimes affect the abundance and diversity of local fauna, transforming architectural design into a form of habitat engineering [29].</w:t>
+      </w:r>
+    </w:p>
+    <w:p>
+      <w:pPr>
+        <w:spacing w:before="0" w:after="0"/>
+      </w:pPr>
+    </w:p>
+    <w:p>
+      <w:pPr>
+        <w:jc w:val="both"/>
+        <w:spacing w:before="0" w:after="120" w:line="360" w:lineRule="auto"/>
+      </w:pPr>
+      <w:r>
+        <w:t xml:space="preserve">Machine learning approaches, particularly deep neural networks trained on remote sensing data and ecological monitoring records, increasingly enable real-time assessment of ecosystem service provision by bio-integrated structures [30]. These tools can quantify carbon sequestration rates, pollination support, water filtration capacity, and microclimate amelioration attributable to living system components, providing the feedback loops necessary for adaptive management of bio-integrated tourism infrastructure.</w:t>
       </w:r>
     </w:p>
     <w:p>
@@ -524,80 +583,6 @@
           <w:b/>
           <w:bCs/>
         </w:rPr>
-        <w:t xml:space="preserve">2.3 Computational Frameworks for Ecological Design</w:t>
-      </w:r>
-    </w:p>
-    <w:p>
-      <w:pPr>
-        <w:spacing w:before="0" w:after="0"/>
-      </w:pPr>
-    </w:p>
-    <w:p>
-      <w:pPr>
-        <w:jc w:val="both"/>
-        <w:spacing w:before="0" w:after="120" w:line="360" w:lineRule="auto"/>
-      </w:pPr>
-      <w:r>
-        <w:t xml:space="preserve">The application of computational methods to bio-integrated design encompasses three principal domains: generative design algorithms that produce form through simulated biological processes, agent-based modeling of organism-infrastructure interactions, and machine learning approaches to predictive ecological performance assessment.</w:t>
-      </w:r>
-    </w:p>
-    <w:p>
-      <w:pPr>
-        <w:spacing w:before="0" w:after="0"/>
-      </w:pPr>
-    </w:p>
-    <w:p>
-      <w:pPr>
-        <w:jc w:val="both"/>
-        <w:spacing w:before="0" w:after="120" w:line="360" w:lineRule="auto"/>
-      </w:pPr>
-      <w:r>
-        <w:t xml:space="preserve">Generative design approaches drawing upon evolutionary computation and morphogenetic algorithms have been extensively developed within architectural research (Shea et al., 2005; Oxman, 2010). These methods employ genetic algorithms, cellular automata, and particle-swarm optimization to generate architectural forms that satisfy multiple performance objectives simultaneously. In bio-integrated contexts, the design objectives extend beyond structural efficiency and environmental control to include habitat provision, ecological connectivity, and nutrient cycling capacity (Colding et al., 2020).</w:t>
-      </w:r>
-    </w:p>
-    <w:p>
-      <w:pPr>
-        <w:spacing w:before="0" w:after="0"/>
-      </w:pPr>
-    </w:p>
-    <w:p>
-      <w:pPr>
-        <w:jc w:val="both"/>
-        <w:spacing w:before="0" w:after="120" w:line="360" w:lineRule="auto"/>
-      </w:pPr>
-      <w:r>
-        <w:t xml:space="preserve">Agent-based models (ABMs) simulate the behavior of individual organisms—birds, insects, marine organisms, microbial communities—within and around built structures, enabling designers to predict and optimize ecological outcomes prior to construction (Grimm &amp; Railsback, 2005). For tourism infrastructure in biodiverse settings, ABMs can evaluate how building massing, surface texture, material chemistry, and lighting regimes affect the abundance and diversity of local fauna, transforming architectural design into a form of habitat engineering (Apfelbeck et al., 2020).</w:t>
-      </w:r>
-    </w:p>
-    <w:p>
-      <w:pPr>
-        <w:spacing w:before="0" w:after="0"/>
-      </w:pPr>
-    </w:p>
-    <w:p>
-      <w:pPr>
-        <w:jc w:val="both"/>
-        <w:spacing w:before="0" w:after="120" w:line="360" w:lineRule="auto"/>
-      </w:pPr>
-      <w:r>
-        <w:t xml:space="preserve">Machine learning approaches, particularly deep neural networks trained on remote sensing data and ecological monitoring records, increasingly enable real-time assessment of ecosystem service provision by bio-integrated structures (Reichstein et al., 2019). These tools can quantify carbon sequestration rates, pollination support, water filtration capacity, and microclimate amelioration attributable to living system components, providing the feedback loops necessary for adaptive management of bio-integrated tourism infrastructure.</w:t>
-      </w:r>
-    </w:p>
-    <w:p>
-      <w:pPr>
-        <w:spacing w:before="0" w:after="0"/>
-      </w:pPr>
-    </w:p>
-    <w:p>
-      <w:pPr>
-        <w:pStyle w:val="Heading2"/>
-        <w:spacing w:before="240" w:after="120" w:line="360" w:lineRule="auto"/>
-      </w:pPr>
-      <w:r>
-        <w:rPr>
-          <w:b/>
-          <w:bCs/>
-        </w:rPr>
         <w:t xml:space="preserve">2.4 Indigenous Ecological Knowledge and Biocultural Design</w:t>
       </w:r>
     </w:p>
@@ -612,21 +597,21 @@
         <w:spacing w:before="0" w:after="120" w:line="360" w:lineRule="auto"/>
       </w:pPr>
       <w:r>
-        <w:t xml:space="preserve">The integration of indigenous ecological knowledge (IEK) into bio-integrated tourism design represents both an ethical imperative and a source of design intelligence accumulated over millennia of human engagement with living systems (Berkes, 2018; Kimmerer, 2013). Indigenous communities worldwide have developed sophisticated understandings of ecological processes—including succession dynamics, interspecies relationships, and landscape-scale nutrient cycling—that complement and often exceed Western scientific knowledge in their spatial and temporal resolution (Tengö et al., 2014).</w:t>
-      </w:r>
-    </w:p>
-    <w:p>
-      <w:pPr>
-        <w:spacing w:before="0" w:after="0"/>
-      </w:pPr>
-    </w:p>
-    <w:p>
-      <w:pPr>
-        <w:jc w:val="both"/>
-        <w:spacing w:before="0" w:after="120" w:line="360" w:lineRule="auto"/>
-      </w:pPr>
-      <w:r>
-        <w:t xml:space="preserve">Biocultural design frameworks (Davidson-Hunt et al., 2012) provide methodological approaches for respectfully incorporating IEK into contemporary design practice without extractive appropriation. These frameworks emphasize partnership, co-design, benefit sharing, and the recognition of indigenous intellectual sovereignty—principles that align with broader movements toward decolonizing design practice (Tlostanova, 2017). Within tourism contexts, the integration of IEK into bio-integrated design simultaneously enhances ecological performance, provides culturally authentic visitor experiences, and supports indigenous economic self-determination—a convergence of environmental, cultural, and social regeneration that exemplifies the holistic ambition of the regenerative paradigm.</w:t>
+        <w:t xml:space="preserve">The integration of indigenous ecological knowledge (IEK) into bio-integrated tourism design represents both an ethical imperative and a source of design intelligence accumulated over millennia of human engagement with living systems [7, 31]. Indigenous communities worldwide have developed sophisticated understandings of ecological processes—including succession dynamics, interspecies relationships, and landscape-scale nutrient cycling—that complement and often exceed Western scientific knowledge in their spatial and temporal resolution [32].</w:t>
+      </w:r>
+    </w:p>
+    <w:p>
+      <w:pPr>
+        <w:spacing w:before="0" w:after="0"/>
+      </w:pPr>
+    </w:p>
+    <w:p>
+      <w:pPr>
+        <w:jc w:val="both"/>
+        <w:spacing w:before="0" w:after="120" w:line="360" w:lineRule="auto"/>
+      </w:pPr>
+      <w:r>
+        <w:t xml:space="preserve">Biocultural design frameworks [33] provide methodological approaches for respectfully incorporating IEK into contemporary design practice without extractive appropriation. These frameworks emphasize partnership, co-design, benefit sharing, and the recognition of indigenous intellectual sovereignty—principles that align with broader movements toward decolonizing design practice [34]. Within tourism contexts, the integration of IEK into bio-integrated design simultaneously enhances ecological performance, provides culturally authentic visitor experiences, and supports indigenous economic self-determination—a convergence of environmental, cultural, and social regeneration that exemplifies the holistic ambition of the regenerative paradigm.</w:t>
       </w:r>
     </w:p>
     <w:p>
@@ -696,7 +681,7 @@
         <w:spacing w:before="0" w:after="120" w:line="360" w:lineRule="auto"/>
       </w:pPr>
       <w:r>
-        <w:t xml:space="preserve">This research employs a convergent mixed-methods design (Creswell &amp; Plano Clark, 2018) integrating three complementary methodological streams: (a) computational modeling and parametric simulation of bio-integrated systems, (b) multi-site case study analysis of operational bio-integrated tourism projects, and (c) ecosystem service quantification using established ecological assessment protocols. The convergent design enables triangulation across quantitative performance data, qualitative design process documentation, and computational predictions, strengthening the validity of findings and enabling the development of generalizable design principles from site-specific observations.</w:t>
+        <w:t xml:space="preserve">This research employs a convergent mixed-methods design [35] integrating three complementary methodological streams: (a) computational modeling and parametric simulation of bio-integrated systems, (b) multi-site case study analysis of operational bio-integrated tourism projects, and (c) ecosystem service quantification using established ecological assessment protocols. The convergent design enables triangulation across quantitative performance data, qualitative design process documentation, and computational predictions, strengthening the validity of findings and enabling the development of generalizable design principles from site-specific observations.</w:t>
       </w:r>
     </w:p>
     <w:p>
@@ -763,7 +748,7 @@
         <w:t xml:space="preserve">Micro-scale (material level):</w:t>
       </w:r>
       <w:r>
-        <w:t xml:space="preserve"> Finite element analysis and agent-based modeling of biological material behavior within building components. This includes modeling mycelial growth patterns within composite panels (using growth algorithms adapted from Dikec et al., 2021), photosynthetic productivity of algae-facade systems under varying irradiance and temperature regimes, and moisture dynamics within living-skin assemblies. Simulations are conducted using Grasshopper/Rhino parametric modeling environments coupled with custom Python scripts implementing biological growth algorithms.</w:t>
+        <w:t xml:space="preserve"> Finite element analysis and agent-based modeling of biological material behavior within building components. This includes modeling mycelial growth patterns within composite panels (using growth algorithms adapted from Dikec et al. [36]), photosynthetic productivity of algae-facade systems under varying irradiance and temperature regimes, and moisture dynamics within living-skin assemblies. Simulations are conducted using Grasshopper/Rhino parametric modeling environments coupled with custom Python scripts implementing biological growth algorithms.</w:t>
       </w:r>
     </w:p>
     <w:p>
@@ -805,7 +790,7 @@
         <w:t xml:space="preserve">Macro-scale (landscape level):</w:t>
       </w:r>
       <w:r>
-        <w:t xml:space="preserve"> Agent-based ecological models simulating fauna movement, habitat utilization, and population dynamics in response to bio-integrated infrastructure. Models are parameterized using species-specific behavioral data from ecological literature and calibrated against monitoring data from case study sites. Landscape connectivity analysis using circuit theory (McRae et al., 2008) evaluates how bio-integrated structures enhance or impede ecological connectivity at the landscape scale.</w:t>
+        <w:t xml:space="preserve"> Agent-based ecological models simulating fauna movement, habitat utilization, and population dynamics in response to bio-integrated infrastructure. Models are parameterized using species-specific behavioral data from ecological literature and calibrated against monitoring data from case study sites. Landscape connectivity analysis using circuit theory [37] evaluates how bio-integrated structures enhance or impede ecological connectivity at the landscape scale.</w:t>
       </w:r>
     </w:p>
     <w:p>
@@ -837,7 +822,7 @@
         <w:spacing w:before="0" w:after="120" w:line="360" w:lineRule="auto"/>
       </w:pPr>
       <w:r>
-        <w:t xml:space="preserve">Case studies were selected through purposive sampling guided by four criteria: (a) the project must incorporate living biological systems as functionally integral building components rather than decorative additions; (b) the project must be operational for a minimum of three years, enabling assessment of biological system maturation and ecological outcomes over ecologically meaningful timescales; (c) quantitative ecological monitoring data must be available or obtainable; and (d) the projects must collectively represent geographic, climatic, and typological diversity to support analytical generalization (Yin, 2018).</w:t>
+        <w:t xml:space="preserve">Case studies were selected through purposive sampling guided by four criteria: (a) the project must incorporate living biological systems as functionally integral building components rather than decorative additions; (b) the project must be operational for a minimum of three years, enabling assessment of biological system maturation and ecological outcomes over ecologically meaningful timescales; (c) quantitative ecological monitoring data must be available or obtainable; and (d) the projects must collectively represent geographic, climatic, and typological diversity to support analytical generalization [38].</w:t>
       </w:r>
     </w:p>
     <w:p>
@@ -969,7 +954,7 @@
         <w:spacing w:before="0" w:after="120" w:line="360" w:lineRule="auto"/>
       </w:pPr>
       <w:r>
-        <w:t xml:space="preserve">Ecosystem service quantification follows the Common International Classification of Ecosystem Services (CICES) framework (Haines-Young &amp; Potschin, 2018), adapted for the built environment context. Services assessed include:</w:t>
+        <w:t xml:space="preserve">Ecosystem service quantification follows the Common International Classification of Ecosystem Services (CICES) framework [39], adapted for the built environment context. Services assessed include:</w:t>
       </w:r>
     </w:p>
     <w:p>
@@ -1064,7 +1049,7 @@
         <w:spacing w:before="0" w:after="120" w:line="360" w:lineRule="auto"/>
       </w:pPr>
       <w:r>
-        <w:t xml:space="preserve">Ecosystem service values are quantified in both biophysical units (tonnes CO₂e, species richness indices, cubic meters of water filtered) and monetary equivalents using benefit transfer methods calibrated to local economic conditions (de Groot et al., 2012). This dual quantification enables comparison across service types and provides economic justification for the typically higher initial capital costs of bio-integrated construction.</w:t>
+        <w:t xml:space="preserve">Ecosystem service values are quantified in both biophysical units (tonnes CO₂e, species richness indices, cubic meters of water filtered) and monetary equivalents using benefit transfer methods calibrated to local economic conditions [40]. This dual quantification enables comparison across service types and provides economic justification for the typically higher initial capital costs of bio-integrated construction.</w:t>
       </w:r>
     </w:p>
     <w:p>
@@ -1214,7 +1199,7 @@
         <w:spacing w:before="0" w:after="120" w:line="360" w:lineRule="auto"/>
       </w:pPr>
       <w:r>
-        <w:t xml:space="preserve">The structural system employs a hybrid approach: primary load-bearing elements utilize bamboo (Guadua angustifolia) harvested from managed plantations, while envelope systems—walls, roof insulation, and interior partitions—are fabricated from Ganoderma lucidum mycelium cultivated on a substrate of cacao pod husks and banana pseudostems. The mycelium panels are not kiln-dried to termination (as is standard industry practice for inert composite production) but maintained in a semi-dormant metabolic state through controlled humidity management within the building envelope. This living condition enables ongoing CO₂ metabolization, volatile organic compound (VOC) absorption, and humidity regulation through fungal transpiration processes (Elsacker et al., 2021).</w:t>
+        <w:t xml:space="preserve">The structural system employs a hybrid approach: primary load-bearing elements utilize bamboo (Guadua angustifolia) harvested from managed plantations, while envelope systems—walls, roof insulation, and interior partitions—are fabricated from Ganoderma lucidum mycelium cultivated on a substrate of cacao pod husks and banana pseudostems. The mycelium panels are not kiln-dried to termination (as is standard industry practice for inert composite production) but maintained in a semi-dormant metabolic state through controlled humidity management within the building envelope. This living condition enables ongoing CO₂ metabolization, volatile organic compound (VOC) absorption, and humidity regulation through fungal transpiration processes [21].</w:t>
       </w:r>
     </w:p>
     <w:p>
@@ -1362,21 +1347,21 @@
         <w:spacing w:before="0" w:after="120" w:line="360" w:lineRule="auto"/>
       </w:pPr>
       <w:r>
-        <w:t xml:space="preserve">The Reef-Integrated Visitor Pavilion addresses the acute challenge facing Maldivian tourism: the simultaneous dependence on and degradation of coral reef ecosystems. Conventional overwater and beachfront tourism infrastructure in the Maldives has been documented to reduce adjacent reef fish biomass by 30–50% and coral cover by 15–25% relative to uninhabited reference reefs (Moritz et al., 2017). The pavilion inverts this relationship, functioning as both visitor accommodation (six underwater suites with direct reef views) and active reef restoration infrastructure.</w:t>
-      </w:r>
-    </w:p>
-    <w:p>
-      <w:pPr>
-        <w:spacing w:before="0" w:after="0"/>
-      </w:pPr>
-    </w:p>
-    <w:p>
-      <w:pPr>
-        <w:jc w:val="both"/>
-        <w:spacing w:before="0" w:after="120" w:line="360" w:lineRule="auto"/>
-      </w:pPr>
-      <w:r>
-        <w:t xml:space="preserve">The submerged structural elements employ bioite—a calcium-carbonate-precipitating concrete alternative developed through microbially induced calcite precipitation (MICP)—whose surface chemistry and micro-topography are algorithmically optimized to promote coral larval settlement and growth (Hao et al., 2022). The structure's geometry was generated through a topology optimization process constrained by both structural requirements (wave loading, dead loads) and ecological objectives (maximizing surface area-to-volume ratio, creating varied micro-habitats across depth gradients, and generating hydrodynamic conditions favorable to coral feeding).</w:t>
+        <w:t xml:space="preserve">The Reef-Integrated Visitor Pavilion addresses the acute challenge facing Maldivian tourism: the simultaneous dependence on and degradation of coral reef ecosystems. Conventional overwater and beachfront tourism infrastructure in the Maldives has been documented to reduce adjacent reef fish biomass by 30–50% and coral cover by 15–25% relative to uninhabited reference reefs [41]. The pavilion inverts this relationship, functioning as both visitor accommodation (six underwater suites with direct reef views) and active reef restoration infrastructure.</w:t>
+      </w:r>
+    </w:p>
+    <w:p>
+      <w:pPr>
+        <w:spacing w:before="0" w:after="0"/>
+      </w:pPr>
+    </w:p>
+    <w:p>
+      <w:pPr>
+        <w:jc w:val="both"/>
+        <w:spacing w:before="0" w:after="120" w:line="360" w:lineRule="auto"/>
+      </w:pPr>
+      <w:r>
+        <w:t xml:space="preserve">The submerged structural elements employ bioite—a calcium-carbonate-precipitating concrete alternative developed through microbially induced calcite precipitation (MICP)—whose surface chemistry and micro-topography are algorithmically optimized to promote coral larval settlement and growth [42]. The structure's geometry was generated through a topology optimization process constrained by both structural requirements (wave loading, dead loads) and ecological objectives (maximizing surface area-to-volume ratio, creating varied micro-habitats across depth gradients, and generating hydrodynamic conditions favorable to coral feeding).</w:t>
       </w:r>
     </w:p>
     <w:p>
@@ -1482,6 +1467,11 @@
     </w:p>
     <w:p>
       <w:pPr>
+        <w:spacing w:before="0" w:after="0"/>
+      </w:pPr>
+    </w:p>
+    <w:p>
+      <w:pPr>
         <w:pStyle w:val="Heading2"/>
         <w:spacing w:before="240" w:after="120" w:line="360" w:lineRule="auto"/>
       </w:pPr>
@@ -1538,7 +1528,7 @@
         <w:spacing w:before="0" w:after="120" w:line="360" w:lineRule="auto"/>
       </w:pPr>
       <w:r>
-        <w:t xml:space="preserve">The design was developed in collaboration with Martu Traditional Owners, whose land management practices—particularly mosaic burning regimes—have maintained landscape ecological diversity for over 40,000 years (Bird et al., 2016). The building's bio-responsive behavior mirrors the pulsed ecology of arid systems: during dry periods, the cryptogamic envelope enters metabolic dormancy, presenting a muted earth-toned appearance; following rainfall events, organisms rapidly rehydrate, transforming the building's appearance to vivid greens and activating evapotranspiratory cooling that reduces interior temperatures by 6–8°C relative to a conventional insulated envelope.</w:t>
+        <w:t xml:space="preserve">The design was developed in collaboration with Martu Traditional Owners, whose land management practices—particularly mosaic burning regimes—have maintained landscape ecological diversity for over 40,000 years [43]. The building's bio-responsive behavior mirrors the pulsed ecology of arid systems: during dry periods, the cryptogamic envelope enters metabolic dormancy, presenting a muted earth-toned appearance; following rainfall events, organisms rapidly rehydrate, transforming the building's appearance to vivid greens and activating evapotranspiratory cooling that reduces interior temperatures by 6–8°C relative to a conventional insulated envelope.</w:t>
       </w:r>
     </w:p>
     <w:p>
@@ -2454,25 +2444,21 @@
         <w:spacing w:before="0" w:after="120" w:line="360" w:lineRule="auto"/>
       </w:pPr>
       <w:r>
-        <w:t xml:space="preserve">Critically, these improvements are not achieved through technological complexity alone but through a fundamental reconceptualization of the building-ecosystem relationship. In each case study, the infrastructure functions as habitat, as metabolic participant, and as ecological connector—roles that conventional buildings, however efficiently they operate, cannot fulfill because they are designed as sealed, inert objects that exclude rather than incorporate biological processes (Armstrong, 2015). The mycelium panels metabolize atmospheric CO₂; the reef structure recruits coral larvae; the cryptogamic envelope photosynthesizes and transpires. Each building is, in a meaningful biological sense, alive—and this aliveness produces the ecological reciprocity that distinguishes regenerative from merely sustainable design.</w:t>
-      </w:r>
-    </w:p>
-    <w:p>
-      <w:pPr>
-        <w:spacing w:before="0" w:after="0"/>
-      </w:pPr>
-    </w:p>
-    <w:p>
-      <w:pPr>
-        <w:ind w:left="720"/>
-        <w:spacing w:before="0" w:after="80" w:line="360" w:lineRule="auto"/>
-      </w:pPr>
-      <w:r>
-        <w:rPr>
-          <w:sz w:val="22"/>
-          <w:szCs w:val="22"/>
-        </w:rPr>
-        <w:t xml:space="preserve">The findings address the criticism leveled by Craft et al. (2017) regarding the gap between regenerative rhetoric and measurable outcomes. By quantifying ecosystem service provision in both biophysical and monetary terms, and by comparing bio-integrated performance against an already-ambitious conventional baseline (highest-level green building certification), the research provides empirical evidence that regenerative design can be operationalized with measurable, significant results. The average economic payback period of 4.6 years for bio-integration investment demonstrates that ecological reciprocity need not come at prohibitive economic cost—a finding with significant implications for the scalability of these approaches.</w:t>
+        <w:t xml:space="preserve">Critically, these improvements are not achieved through technological complexity alone but through a fundamental reconceptualization of the building-ecosystem relationship. In each case study, the infrastructure functions as habitat, as metabolic participant, and as ecological connector—roles that conventional buildings, however efficiently they operate, cannot fulfill because they are designed as sealed, inert objects that exclude rather than incorporate biological processes [5]. The mycelium panels metabolize atmospheric CO₂; the reef structure recruits coral larvae; the cryptogamic envelope photosynthesizes and transpires. Each building is, in a meaningful biological sense, alive—and this aliveness produces the ecological reciprocity that distinguishes regenerative from merely sustainable design.</w:t>
+      </w:r>
+    </w:p>
+    <w:p>
+      <w:pPr>
+        <w:spacing w:before="0" w:after="0"/>
+      </w:pPr>
+    </w:p>
+    <w:p>
+      <w:pPr>
+        <w:jc w:val="both"/>
+        <w:spacing w:before="0" w:after="120" w:line="360" w:lineRule="auto"/>
+      </w:pPr>
+      <w:r>
+        <w:t xml:space="preserve">The findings address the criticism leveled by Craft et al. [16] regarding the gap between regenerative rhetoric and measurable outcomes. By quantifying ecosystem service provision in both biophysical and monetary terms, and by comparing bio-integrated performance against an already-ambitious conventional baseline (highest-level green building certification), the research provides empirical evidence that regenerative design can be operationalized with measurable, significant results. The average economic payback period of 4.6 years for bio-integration investment demonstrates that ecological reciprocity need not come at prohibitive economic cost—a finding with significant implications for the scalability of these approaches.</w:t>
       </w:r>
     </w:p>
     <w:p>
@@ -2518,7 +2504,7 @@
         <w:spacing w:before="0" w:after="120" w:line="360" w:lineRule="auto"/>
       </w:pPr>
       <w:r>
-        <w:t xml:space="preserve">This finding aligns with broader trends in computational design research (Oxman, 2010; Shea et al., 2005) but extends them into novel territory. Where previous computational design applications have predominantly optimized for physical performance metrics (structural efficiency, thermal comfort, daylight availability), bio-integrated computational design introduces ecological objectives—biodiversity support, habitat connectivity, ecosystem service provision—as primary design drivers. This expansion of the computational design objective space represents a significant methodological contribution, requiring new simulation tools (biological growth models, ecological agent-based models) and new optimization frameworks capable of handling the longer timescales and inherent uncertainties of ecological processes.</w:t>
+        <w:t xml:space="preserve">This finding aligns with broader trends in computational design research [25, 26] but extends them into novel territory. Where previous computational design applications have predominantly optimized for physical performance metrics (structural efficiency, thermal comfort, daylight availability), bio-integrated computational design introduces ecological objectives—biodiversity support, habitat connectivity, ecosystem service provision—as primary design drivers. This expansion of the computational design objective space represents a significant methodological contribution, requiring new simulation tools (biological growth models, ecological agent-based models) and new optimization frameworks capable of handling the longer timescales and inherent uncertainties of ecological processes.</w:t>
       </w:r>
     </w:p>
     <w:p>
@@ -2574,15 +2560,11 @@
     </w:p>
     <w:p>
       <w:pPr>
-        <w:ind w:left="720"/>
-        <w:spacing w:before="0" w:after="80" w:line="360" w:lineRule="auto"/>
-      </w:pPr>
-      <w:r>
-        <w:rPr>
-          <w:sz w:val="22"/>
-          <w:szCs w:val="22"/>
-        </w:rPr>
-        <w:t xml:space="preserve">This finding resonates with Kimmerer's (2013) argument that indigenous knowledge systems embody forms of ecological understanding—relational, reciprocal, place-specific—that Western scientific frameworks often fail to capture. The integration of IEK into bio-integrated design is not merely a matter of cultural sensitivity or social license (though it is also these things) but of accessing design intelligence refined through millennia of attentive engagement with specific landscapes. The challenge for practitioners lies in developing ethical, non-extractive frameworks for such integration—ensuring that indigenous communities retain intellectual sovereignty over their knowledge while benefiting materially from its application in commercial tourism contexts (Davidson-Hunt et al., 2012; Tengö et al., 2014).</w:t>
+        <w:jc w:val="both"/>
+        <w:spacing w:before="0" w:after="120" w:line="360" w:lineRule="auto"/>
+      </w:pPr>
+      <w:r>
+        <w:t xml:space="preserve">This finding resonates with Kimmerer's argument [31] that indigenous knowledge systems embody forms of ecological understanding—relational, reciprocal, place-specific—that Western scientific frameworks often fail to capture. The integration of IEK into bio-integrated design is not merely a matter of cultural sensitivity or social license (though it is also these things) but of accessing design intelligence refined through millennia of attentive engagement with specific landscapes. The challenge for practitioners lies in developing ethical, non-extractive frameworks for such integration—ensuring that indigenous communities retain intellectual sovereignty over their knowledge while benefiting materially from its application in commercial tourism contexts [33, 32].</w:t>
       </w:r>
     </w:p>
     <w:p>
@@ -2733,7 +2715,7 @@
         <w:spacing w:before="0" w:after="120" w:line="360" w:lineRule="auto"/>
       </w:pPr>
       <w:r>
-        <w:t xml:space="preserve">Each level represents increased depth of biological integration, increased ecological contribution, and increased design and management complexity. The BIMM enables practitioners, developers, and policymakers to benchmark current practice, set aspirational targets, and identify specific interventions required to advance along the maturity continuum. Critically, the model acknowledges that appropriate maturity levels will vary by context—Level 5 may be achievable in tropical forest settings but impractical in urban contexts—avoiding the implication that all projects must aspire to the same endpoint.</w:t>
+        <w:t xml:space="preserve">Each level represents increased depth of biological integration, increased ecological contribution, and increased design and management complexity. The BIMM enables practitioners, developers, and policymakers to benchmark current practice, set aspirational targets, and identify specific interventions required to advance along the maturity continuum.</w:t>
       </w:r>
     </w:p>
     <w:p>
@@ -2895,20 +2877,6 @@
         <w:spacing w:before="0" w:after="120" w:line="360" w:lineRule="auto"/>
       </w:pPr>
       <w:r>
-        <w:t xml:space="preserve">The implications of these findings extend beyond the immediate domain of tourism architecture to address broader questions in regenerative design theory, computational ecology, and the governance of human-nature relations in the built environment.</w:t>
-      </w:r>
-    </w:p>
-    <w:p>
-      <w:pPr>
-        <w:spacing w:before="0" w:after="0"/>
-      </w:pPr>
-    </w:p>
-    <w:p>
-      <w:pPr>
-        <w:jc w:val="both"/>
-        <w:spacing w:before="0" w:after="120" w:line="360" w:lineRule="auto"/>
-      </w:pPr>
-      <w:r>
         <w:t xml:space="preserve">For design practitioners, the research provides evidence that bio-integration is not merely speculative or aspirational but practically achievable with existing materials, technologies, and computational tools. The Bio-Integration Maturity Model offers a structured pathway for practitioners seeking to advance beyond conventional green building practice toward genuinely regenerative outcomes. The case studies demonstrate that bio-integration is applicable across diverse climatic zones, construction typologies, and budgetary contexts—countering the perception that living buildings are viable only as expensive demonstration projects in favorable climates.</w:t>
       </w:r>
     </w:p>
@@ -2923,21 +2891,21 @@
         <w:spacing w:before="0" w:after="120" w:line="360" w:lineRule="auto"/>
       </w:pPr>
       <w:r>
-        <w:t xml:space="preserve">For policymakers and planning authorities, the research suggests that current green building certification systems—oriented around harm reduction metrics—are insufficient frameworks for assessing or incentivizing regenerative design. The BIMM provides a complementary assessment tool that evaluates positive ecological contribution rather than merely reduced negative impact, enabling planning systems to differentiate between buildings that are "less bad" and those that are actively beneficial to their ecological context. Tourism planning policies that require or incentivize higher BIMM levels for developments within ecological buffer zones, biological corridors, or marine protected area adjacencies could significantly enhance conservation outcomes while maintaining economic development.</w:t>
-      </w:r>
-    </w:p>
-    <w:p>
-      <w:pPr>
-        <w:spacing w:before="0" w:after="0"/>
-      </w:pPr>
-    </w:p>
-    <w:p>
-      <w:pPr>
-        <w:jc w:val="both"/>
-        <w:spacing w:before="0" w:after="120" w:line="360" w:lineRule="auto"/>
-      </w:pPr>
-      <w:r>
-        <w:t xml:space="preserve">For the academic community, the research opens several productive trajectories. The integration of ecological simulation into architectural design computation represents a methodological frontier requiring collaboration between architects, ecologists, computer scientists, and materials engineers. The role of indigenous ecological knowledge in informing bio-integrated design demands further investigation through genuinely partnership-based research methodologies. The long-term dynamics of bio-integrated systems—how they develop, adapt, and potentially degrade over decadal timescales—require sustained monitoring programs that extend well beyond typical academic research timeframes.</w:t>
+        <w:t xml:space="preserve">For policymakers and planning authorities, the research suggests that current green building certification systems—oriented around harm reduction metrics—are insufficient frameworks for assessing or incentivizing regenerative design. The BIMM provides a complementary assessment tool that evaluates positive ecological contribution rather than merely reduced negative impact, enabling planning systems to differentiate between buildings that are "less bad" and those that are actively beneficial to their ecological context.</w:t>
+      </w:r>
+    </w:p>
+    <w:p>
+      <w:pPr>
+        <w:spacing w:before="0" w:after="0"/>
+      </w:pPr>
+    </w:p>
+    <w:p>
+      <w:pPr>
+        <w:jc w:val="both"/>
+        <w:spacing w:before="0" w:after="120" w:line="360" w:lineRule="auto"/>
+      </w:pPr>
+      <w:r>
+        <w:t xml:space="preserve">For the academic community, the research opens several productive trajectories. The integration of ecological simulation into architectural design computation represents a methodological frontier requiring collaboration between architects, ecologists, computer scientists, and materials engineers. The role of indigenous ecological knowledge in informing bio-integrated design demands further investigation through genuinely partnership-based research methodologies [33, 34].</w:t>
       </w:r>
     </w:p>
     <w:p>
@@ -2969,63 +2937,63 @@
         <w:spacing w:before="0" w:after="120" w:line="360" w:lineRule="auto"/>
       </w:pPr>
       <w:r>
-        <w:t xml:space="preserve">Several directions for future research and development emerge from this work. First, scaling bio-integration from individual buildings to district and landscape scales represents a critical frontier. How might networks of bio-integrated structures collectively function as ecological infrastructure—creating habitat corridors, managing watershed hydrology, supporting pollinator networks—at scales relevant to landscape ecology? Computational tools for landscape-scale bio-integration design, building upon the macro-scale modeling demonstrated here, require substantial further development.</w:t>
-      </w:r>
-    </w:p>
-    <w:p>
-      <w:pPr>
-        <w:spacing w:before="0" w:after="0"/>
-      </w:pPr>
-    </w:p>
-    <w:p>
-      <w:pPr>
-        <w:jc w:val="both"/>
-        <w:spacing w:before="0" w:after="120" w:line="360" w:lineRule="auto"/>
-      </w:pPr>
-      <w:r>
-        <w:t xml:space="preserve">Second, the development of biological building materials requires acceleration. While mycelium composites, biite, and cryptogamic assemblies represent proven materials, the palette of available living building components remains limited relative to the diversity of biological systems that could potentially be integrated into architecture. Research into engineered living materials (ELMs)—including self-healing bioconcretes, pollution-sensing biofilms, and energy-harvesting photosynthetic membranes—promises to expand significantly the functional capabilities of bio-integrated construction in the coming decade (Nguyen et al., 2018; Gilbert &amp; Ellis, 2019).</w:t>
-      </w:r>
-    </w:p>
-    <w:p>
-      <w:pPr>
-        <w:spacing w:before="0" w:after="0"/>
-      </w:pPr>
-    </w:p>
-    <w:p>
-      <w:pPr>
-        <w:jc w:val="both"/>
-        <w:spacing w:before="0" w:after="120" w:line="360" w:lineRule="auto"/>
-      </w:pPr>
-      <w:r>
-        <w:t xml:space="preserve">Third, the climate adaptation dimension of bio-integrated design warrants focused investigation. As tourism destinations face increasing climate stress—coral bleaching, wildfire intensification, extreme heat events, coastal erosion—bio-integrated infrastructure's capacity for biological adaptation (evolution, succession, migration) offers resilience advantages fundamentally unavailable to conventional inert construction. How might bio-integrated systems be designed to adapt to climate trajectories rather than merely current conditions? This question connects bio-integrated design to broader debates about transformative adaptation and the design of systems for uncertain futures (Wise et al., 2014).</w:t>
-      </w:r>
-    </w:p>
-    <w:p>
-      <w:pPr>
-        <w:spacing w:before="0" w:after="0"/>
-      </w:pPr>
-    </w:p>
-    <w:p>
-      <w:pPr>
-        <w:jc w:val="both"/>
-        <w:spacing w:before="0" w:after="120" w:line="360" w:lineRule="auto"/>
-      </w:pPr>
-      <w:r>
-        <w:t xml:space="preserve">Fourth, the economic and governance frameworks necessary for mainstreaming bio-integration require development. Payment for ecosystem services (PES) mechanisms, biodiversity offset markets, carbon credit systems, and green bonds all represent potential financial instruments for valuing and monetizing the ecological contributions of bio-integrated infrastructure, yet significant institutional barriers remain. Research at the intersection of ecological economics, environmental governance, and construction finance could identify pathways for aligning financial incentives with regenerative design outcomes.</w:t>
-      </w:r>
-    </w:p>
-    <w:p>
-      <w:pPr>
-        <w:spacing w:before="0" w:after="0"/>
-      </w:pPr>
-    </w:p>
-    <w:p>
-      <w:pPr>
-        <w:jc w:val="both"/>
-        <w:spacing w:before="0" w:after="120" w:line="360" w:lineRule="auto"/>
-      </w:pPr>
-      <w:r>
-        <w:t xml:space="preserve">Finally, the ethical dimensions of bio-integrated design—the moral status of building-organisms, the rights of indigenous knowledge holders, the politics of ecological stewardship within commercial tourism—demand sustained philosophical and social-scientific attention. Bio-integrated design blurs fundamental categories—living/built, natural/artificial, organism/artifact—that have structured Western environmental thought. Navigating these conceptual disruptions responsibly requires not only technical innovation but also ethical reflection, democratic deliberation, and deep engagement with diverse cultural perspectives on the relationship between human making and the more-than-human world.</w:t>
+        <w:t xml:space="preserve">Several directions for future research and development emerge from this work. First, scaling bio-integration from individual buildings to district and landscape scales represents a critical frontier. How might networks of bio-integrated structures collectively function as ecological infrastructure—creating habitat corridors, managing watershed hydrology, supporting pollinator networks—at scales relevant to landscape ecology?</w:t>
+      </w:r>
+    </w:p>
+    <w:p>
+      <w:pPr>
+        <w:spacing w:before="0" w:after="0"/>
+      </w:pPr>
+    </w:p>
+    <w:p>
+      <w:pPr>
+        <w:jc w:val="both"/>
+        <w:spacing w:before="0" w:after="120" w:line="360" w:lineRule="auto"/>
+      </w:pPr>
+      <w:r>
+        <w:t xml:space="preserve">Second, the development of biological building materials requires acceleration. Research into engineered living materials (ELMs)—including self-healing bioconcretes, pollution-sensing biofilms, and energy-harvesting photosynthetic membranes—promises to expand significantly the functional capabilities of bio-integrated construction [44, 45].</w:t>
+      </w:r>
+    </w:p>
+    <w:p>
+      <w:pPr>
+        <w:spacing w:before="0" w:after="0"/>
+      </w:pPr>
+    </w:p>
+    <w:p>
+      <w:pPr>
+        <w:jc w:val="both"/>
+        <w:spacing w:before="0" w:after="120" w:line="360" w:lineRule="auto"/>
+      </w:pPr>
+      <w:r>
+        <w:t xml:space="preserve">Third, the climate adaptation dimension of bio-integrated design warrants focused investigation. As tourism destinations face increasing climate stress—coral bleaching, wildfire intensification, extreme heat events, coastal erosion—bio-integrated infrastructure's capacity for biological adaptation (evolution, succession, migration) offers resilience advantages fundamentally unavailable to conventional inert construction [46].</w:t>
+      </w:r>
+    </w:p>
+    <w:p>
+      <w:pPr>
+        <w:spacing w:before="0" w:after="0"/>
+      </w:pPr>
+    </w:p>
+    <w:p>
+      <w:pPr>
+        <w:jc w:val="both"/>
+        <w:spacing w:before="0" w:after="120" w:line="360" w:lineRule="auto"/>
+      </w:pPr>
+      <w:r>
+        <w:t xml:space="preserve">Fourth, the economic and governance frameworks necessary for mainstreaming bio-integration require development. Payment for ecosystem services (PES) mechanisms, biodiversity offset markets, carbon credit systems, and green bonds all represent potential financial instruments for valuing and monetizing the ecological contributions of bio-integrated infrastructure, yet significant institutional barriers remain.</w:t>
+      </w:r>
+    </w:p>
+    <w:p>
+      <w:pPr>
+        <w:spacing w:before="0" w:after="0"/>
+      </w:pPr>
+    </w:p>
+    <w:p>
+      <w:pPr>
+        <w:jc w:val="both"/>
+        <w:spacing w:before="0" w:after="120" w:line="360" w:lineRule="auto"/>
+      </w:pPr>
+      <w:r>
+        <w:t xml:space="preserve">Finally, the ethical dimensions of bio-integrated design—the moral status of building-organisms, the rights of indigenous knowledge holders, the politics of ecological stewardship within commercial tourism—demand sustained philosophical and social-scientific attention. Bio-integrated design blurs fundamental categories—living/built, natural/artificial, organism/artifact—that have structured Western environmental thought.</w:t>
       </w:r>
     </w:p>
     <w:p>
@@ -3080,11 +3048,6 @@
     </w:p>
     <w:p>
       <w:pPr>
-        <w:spacing w:before="0" w:after="0"/>
-      </w:pPr>
-    </w:p>
-    <w:p>
-      <w:pPr>
         <w:pStyle w:val="Heading1"/>
         <w:spacing w:before="360" w:after="120" w:line="360" w:lineRule="auto"/>
       </w:pPr>
@@ -3105,245 +3068,947 @@
     </w:p>
     <w:p>
       <w:pPr>
-        <w:ind w:left="720"/>
-        <w:spacing w:before="0" w:after="80" w:line="360" w:lineRule="auto"/>
-      </w:pPr>
-      <w:r>
-        <w:rPr>
-          <w:sz w:val="22"/>
-          <w:szCs w:val="22"/>
-        </w:rPr>
-        <w:t xml:space="preserve">Apfelbeck, B., Snep, R. P.,";";";";"; "; Hauck, T. E., Ferguson, J., Holy, M.,"; "; Jakoby, C., MacIvor, J. S., &amp; Weisser, W. W. (2020). Designing wildlife-inclusive cities that support human-animal co-existence. Landscape and Urban Planning, 200, 103817. https://doi.org/10.1016/j.landurbplan.2020.103817</w:t>
-      </w:r>
-    </w:p>
-    <w:p>
-      <w:pPr>
-        <w:spacing w:before="0" w:after="0"/>
-      </w:pPr>
-    </w:p>
-    <w:p>
-      <w:pPr>
-        <w:ind w:left="720"/>
-        <w:spacing w:before="0" w:after="80" w:line="360" w:lineRule="auto"/>
-      </w:pPr>
-      <w:r>
-        <w:rPr>
-          <w:sz w:val="22"/>
-          <w:szCs w:val="22"/>
-        </w:rPr>
-        <w:t xml:space="preserve">Armstrong, R. (2015). Star Ark: A living, self-sustaining spaceship. Springer.</w:t>
-      </w:r>
-    </w:p>
-    <w:p>
-      <w:pPr>
-        <w:spacing w:before="0" w:after="0"/>
-      </w:pPr>
-    </w:p>
-    <w:p>
-      <w:pPr>
-        <w:ind w:left="720"/>
-        <w:spacing w:before="0" w:after="80" w:line="360" w:lineRule="auto"/>
-      </w:pPr>
-      <w:r>
-        <w:rPr>
-          <w:sz w:val="22"/>
-          <w:szCs w:val="22"/>
-        </w:rPr>
-        <w:t xml:space="preserve">Bellato, L., Frantzeskaki, N., &amp; Brearley, F. Q. (2022). Regenerative tourism: A conceptual framework leveraging theory and practice. Tourism Geographies, 24(6–7), 1026–1046. https://doi.org/10.1080/14616688.2022.2044376</w:t>
-      </w:r>
-    </w:p>
-    <w:p>
-      <w:pPr>
-        <w:spacing w:before="0" w:after="0"/>
-      </w:pPr>
-    </w:p>
-    <w:p>
-      <w:pPr>
-        <w:ind w:left="720"/>
-        <w:spacing w:before="0" w:after="80" w:line="360" w:lineRule="auto"/>
-      </w:pPr>
-      <w:r>
-        <w:rPr>
-          <w:sz w:val="22"/>
-          <w:szCs w:val="22"/>
-        </w:rPr>
-        <w:t xml:space="preserve">Benyus, J. M. (2002). Biomimicry: Innovation inspired by nature. Harper Perennial.</w:t>
-      </w:r>
-    </w:p>
-    <w:p>
-      <w:pPr>
-        <w:spacing w:before="0" w:after="0"/>
-      </w:pPr>
-    </w:p>
-    <w:p>
-      <w:pPr>
-        <w:ind w:left="720"/>
-        <w:spacing w:before="0" w:after="80" w:line="360" w:lineRule="auto"/>
-      </w:pPr>
-      <w:r>
-        <w:rPr>
-          <w:sz w:val="22"/>
-          <w:szCs w:val="22"/>
-        </w:rPr>
-        <w:t xml:space="preserve">Berkes, F. (2018). Sacred ecology (4th ed.). Routledge.</w:t>
-      </w:r>
-    </w:p>
-    <w:p>
-      <w:pPr>
-        <w:spacing w:before="0" w:after="0"/>
-      </w:pPr>
-    </w:p>
-    <w:p>
-      <w:pPr>
-        <w:ind w:left="720"/>
-        <w:spacing w:before="0" w:after="80" w:line="360" w:lineRule="auto"/>
-      </w:pPr>
-      <w:r>
-        <w:rPr>
-          <w:sz w:val="22"/>
-          <w:szCs w:val="22"/>
-        </w:rPr>
-        <w:t xml:space="preserve">Bird, R. B., Codding, B. F., Kauhanen, P. G., &amp; Bird, D. W. (2016). Aboriginal hunting buffers climate-driven fire-size variability in Australia's spinifex grasslands. Proceedings of the National Academy of Sciences, 113(38), 10208–10213. https://doi.org/10.1073/pnas.1609972113</w:t>
-      </w:r>
-    </w:p>
-    <w:p>
-      <w:pPr>
-        <w:spacing w:before="0" w:after="0"/>
-      </w:pPr>
-    </w:p>
-    <w:p>
-      <w:pPr>
-        <w:ind w:left="720"/>
-        <w:spacing w:before="0" w:after="80" w:line="360" w:lineRule="auto"/>
-      </w:pPr>
-      <w:r>
-        <w:rPr>
-          <w:sz w:val="22"/>
-          <w:szCs w:val="22"/>
-        </w:rPr>
-        <w:t xml:space="preserve">Cervera Sardá, R., &amp; Vicente, J. (2020). Case study on the optimization of algae photobioreactor facades for building energy performance. Journal of Facade Design and Engineering, 8(1), 1–22. https://doi.org/10.7480/jfde.2020.1.4700</w:t>
-      </w:r>
-    </w:p>
-    <w:p>
-      <w:pPr>
-        <w:spacing w:before="0" w:after="0"/>
-      </w:pPr>
-    </w:p>
-    <w:p>
-      <w:pPr>
-        <w:ind w:left="720"/>
-        <w:spacing w:before="0" w:after="80" w:line="360" w:lineRule="auto"/>
-      </w:pPr>
-      <w:r>
-        <w:rPr>
-          <w:sz w:val="22"/>
-          <w:szCs w:val="22"/>
-        </w:rPr>
-        <w:t xml:space="preserve">Cole, R. J. (2012). Regenerative design and development: Current theory and practice. Building Research &amp; Information, 40(1), 1–6. https://doi.org/10.1080/09613218.2012.617516</w:t>
-      </w:r>
-    </w:p>
-    <w:p>
-      <w:pPr>
-        <w:spacing w:before="0" w:after="0"/>
-      </w:pPr>
-    </w:p>
-    <w:p>
-      <w:pPr>
-        <w:ind w:left="720"/>
-        <w:spacing w:before="0" w:after="80" w:line="360" w:lineRule="auto"/>
-      </w:pPr>
-      <w:r>
-        <w:rPr>
-          <w:sz w:val="22"/>
-          <w:szCs w:val="22"/>
-        </w:rPr>
-        <w:t xml:space="preserve">Colding, J., Giusti, M., Haga, A., Wallhagen, M., &amp; Barthel, S. (2020). Enabling relationships with nature in cities. Sustainability, 12(11), 4394. https://doi.org/10.3390/su12114394</w:t>
-      </w:r>
-    </w:p>
-    <w:p>
-      <w:pPr>
-        <w:spacing w:before="0" w:after="0"/>
-      </w:pPr>
-    </w:p>
-    <w:p>
-      <w:pPr>
-        <w:ind w:left="720"/>
-        <w:spacing w:before="0" w:after="80" w:line="360" w:lineRule="auto"/>
-      </w:pPr>
-      <w:r>
-        <w:rPr>
-          <w:sz w:val="22"/>
-          <w:szCs w:val="22"/>
-        </w:rPr>
-        <w:t xml:space="preserve">Craft, W., Ding, L., Prasad, D., Partridge, L., &amp; Else, D. (2017). Development of a regenerative design model for building retrofits. Procedia Engineering, 180, 658–668. https://doi.org/10.1016/j.proeng.2017.04.225</w:t>
-      </w:r>
-    </w:p>
-    <w:p>
-      <w:pPr>
-        <w:spacing w:before="0" w:after="0"/>
-      </w:pPr>
-    </w:p>
-    <w:p>
-      <w:pPr>
-        <w:ind w:left="720"/>
-        <w:spacing w:before="0" w:after="80" w:line="360" w:lineRule="auto"/>
-      </w:pPr>
-      <w:r>
-        <w:rPr>
-          <w:sz w:val="22"/>
-          <w:szCs w:val="22"/>
-        </w:rPr>
-        <w:t xml:space="preserve">Creswell, J. W., &amp; Plano Clark, V. L. (2018). Designing and conducting mixed methods research (3rd ed.). SAGE.</w:t>
-      </w:r>
-    </w:p>
-    <w:p>
-      <w:pPr>
-        <w:spacing w:before="0" w:after="0"/>
-      </w:pPr>
-    </w:p>
-    <w:p>
-      <w:pPr>
-        <w:ind w:left="720"/>
-        <w:spacing w:before="0" w:after="80" w:line="360" w:lineRule="auto"/>
-      </w:pPr>
-      <w:r>
-        <w:rPr>
-          <w:sz w:val="22"/>
-          <w:szCs w:val="22"/>
-        </w:rPr>
-        <w:t xml:space="preserve">Cruz, M., &amp; Pike, S. (2020). Neoplasmatic design: Design experimentation with bio-architectural composites. UCL Press.</w:t>
-      </w:r>
-    </w:p>
-    <w:p>
-      <w:pPr>
-        <w:spacing w:before="0" w:after="0"/>
-      </w:pPr>
-    </w:p>
-    <w:p>
-      <w:pPr>
-        <w:ind w:left="720"/>
-        <w:spacing w:before="0" w:after="80" w:line="360" w:lineRule="auto"/>
-      </w:pPr>
-      <w:r>
-        <w:rPr>
-          <w:sz w:val="22"/>
-          <w:szCs w:val="22"/>
-        </w:rPr>
-        <w:t xml:space="preserve">Davidson-Hunt, I. J., Turner, K. L., Mead, A. T. P., Cabrera-Lopez, J., Bolton, R., Idrobo, C. J., Miretski, I., Morrison, A., &amp; Robson, J. P. (2012). Biocultural design: A new conceptual framework for sustainable development in rural indigenous and local communities. SAPIENS, 5(2), 33–45.</w:t>
-      </w:r>
-    </w:p>
-    <w:p>
-      <w:pPr>
-        <w:spacing w:before="0" w:after="0"/>
-      </w:pPr>
-    </w:p>
-    <w:p>
-      <w:pPr>
-        <w:jc w:val="both"/>
-        <w:spacing w:before="0" w:after="120" w:line="360" w:lineRule="auto"/>
-      </w:pPr>
-      <w:r>
-        <w:t xml:space="preserve">de Groot, R., Brander, L., van der Ploeg, S., Costanza, R., Bernard, F., Braat, L., Christie, M., Crossman, N., Ghermandi, A., Hein, L., Hussain, S., Kumar, P., McVittie, A., Portela, R., Rodriguez, L. C., ten Brink, P., &amp; van Beukering, P. (2012). Global estimates of the value of ecosystems and their services in monetary units. </w:t>
+        <w:jc w:val="both"/>
+        <w:spacing w:before="0" w:after="120" w:line="360" w:lineRule="auto"/>
+      </w:pPr>
+      <w:r>
+        <w:t xml:space="preserve">[1] Lenzen, M., Sun, Y. Y., Faturay, F., Ting, Y. P., Geschke, A., &amp; Malik, A. (2018). The carbon footprint of global tourism. </w:t>
+      </w:r>
+      <w:r>
+        <w:rPr>
+          <w:i/>
+          <w:iCs/>
+        </w:rPr>
+        <w:t xml:space="preserve">Nature Climate Change</w:t>
+      </w:r>
+      <w:r>
+        <w:t xml:space="preserve">, 8(6), 522–528.</w:t>
+      </w:r>
+    </w:p>
+    <w:p>
+      <w:pPr>
+        <w:spacing w:before="0" w:after="0"/>
+      </w:pPr>
+    </w:p>
+    <w:p>
+      <w:pPr>
+        <w:jc w:val="both"/>
+        <w:spacing w:before="0" w:after="120" w:line="360" w:lineRule="auto"/>
+      </w:pPr>
+      <w:r>
+        <w:t xml:space="preserve">[2] Gössling, S., &amp; Peeters, P. (2015). Assessing tourism's global environmental impact 1900–2050. </w:t>
+      </w:r>
+      <w:r>
+        <w:rPr>
+          <w:i/>
+          <w:iCs/>
+        </w:rPr>
+        <w:t xml:space="preserve">Journal of Sustainable Tourism</w:t>
+      </w:r>
+      <w:r>
+        <w:t xml:space="preserve">, 23(5), 639–659.</w:t>
+      </w:r>
+    </w:p>
+    <w:p>
+      <w:pPr>
+        <w:spacing w:before="0" w:after="0"/>
+      </w:pPr>
+    </w:p>
+    <w:p>
+      <w:pPr>
+        <w:jc w:val="both"/>
+        <w:spacing w:before="0" w:after="120" w:line="360" w:lineRule="auto"/>
+      </w:pPr>
+      <w:r>
+        <w:t xml:space="preserve">[3] Higgins-Desbiolles, F. (2018). Sustainable tourism: Sustaining tourism or something more? </w:t>
+      </w:r>
+      <w:r>
+        <w:rPr>
+          <w:i/>
+          <w:iCs/>
+        </w:rPr>
+        <w:t xml:space="preserve">Tourism Management Perspectives</w:t>
+      </w:r>
+      <w:r>
+        <w:t xml:space="preserve">, 25, 157–160.</w:t>
+      </w:r>
+    </w:p>
+    <w:p>
+      <w:pPr>
+        <w:spacing w:before="0" w:after="0"/>
+      </w:pPr>
+    </w:p>
+    <w:p>
+      <w:pPr>
+        <w:jc w:val="both"/>
+        <w:spacing w:before="0" w:after="120" w:line="360" w:lineRule="auto"/>
+      </w:pPr>
+      <w:r>
+        <w:t xml:space="preserve">[4] Benyus, J. M. (2002). </w:t>
+      </w:r>
+      <w:r>
+        <w:rPr>
+          <w:i/>
+          <w:iCs/>
+        </w:rPr>
+        <w:t xml:space="preserve">Biomimicry: Innovation Inspired by Nature</w:t>
+      </w:r>
+      <w:r>
+        <w:t xml:space="preserve">. Harper Perennial.</w:t>
+      </w:r>
+    </w:p>
+    <w:p>
+      <w:pPr>
+        <w:spacing w:before="0" w:after="0"/>
+      </w:pPr>
+    </w:p>
+    <w:p>
+      <w:pPr>
+        <w:jc w:val="both"/>
+        <w:spacing w:before="0" w:after="120" w:line="360" w:lineRule="auto"/>
+      </w:pPr>
+      <w:r>
+        <w:t xml:space="preserve">[5] Armstrong, R. (2015). </w:t>
+      </w:r>
+      <w:r>
+        <w:rPr>
+          <w:i/>
+          <w:iCs/>
+        </w:rPr>
+        <w:t xml:space="preserve">Star Ark: A Living, Self-Sustaining Spaceship</w:t>
+      </w:r>
+      <w:r>
+        <w:t xml:space="preserve">. Springer.</w:t>
+      </w:r>
+    </w:p>
+    <w:p>
+      <w:pPr>
+        <w:spacing w:before="0" w:after="0"/>
+      </w:pPr>
+    </w:p>
+    <w:p>
+      <w:pPr>
+        <w:jc w:val="both"/>
+        <w:spacing w:before="0" w:after="120" w:line="360" w:lineRule="auto"/>
+      </w:pPr>
+      <w:r>
+        <w:t xml:space="preserve">[6] Menges, A., &amp; Reichert, S. (2015). Performative wood: Physically programming the responsive architecture of the HygroScope and HygroSkin projects. </w:t>
+      </w:r>
+      <w:r>
+        <w:rPr>
+          <w:i/>
+          <w:iCs/>
+        </w:rPr>
+        <w:t xml:space="preserve">Architectural Design</w:t>
+      </w:r>
+      <w:r>
+        <w:t xml:space="preserve">, 85(5), 66–73.</w:t>
+      </w:r>
+    </w:p>
+    <w:p>
+      <w:pPr>
+        <w:spacing w:before="0" w:after="0"/>
+      </w:pPr>
+    </w:p>
+    <w:p>
+      <w:pPr>
+        <w:jc w:val="both"/>
+        <w:spacing w:before="0" w:after="120" w:line="360" w:lineRule="auto"/>
+      </w:pPr>
+      <w:r>
+        <w:t xml:space="preserve">[7] Berkes, F. (2018). </w:t>
+      </w:r>
+      <w:r>
+        <w:rPr>
+          <w:i/>
+          <w:iCs/>
+        </w:rPr>
+        <w:t xml:space="preserve">Sacred Ecology</w:t>
+      </w:r>
+      <w:r>
+        <w:t xml:space="preserve"> (4th ed.). Routledge.</w:t>
+      </w:r>
+    </w:p>
+    <w:p>
+      <w:pPr>
+        <w:spacing w:before="0" w:after="0"/>
+      </w:pPr>
+    </w:p>
+    <w:p>
+      <w:pPr>
+        <w:jc w:val="both"/>
+        <w:spacing w:before="0" w:after="120" w:line="360" w:lineRule="auto"/>
+      </w:pPr>
+      <w:r>
+        <w:t xml:space="preserve">[8] Mang, P., &amp; Reed, B. (2012). Designing from place: A regenerative framework and methodology. </w:t>
+      </w:r>
+      <w:r>
+        <w:rPr>
+          <w:i/>
+          <w:iCs/>
+        </w:rPr>
+        <w:t xml:space="preserve">Building Research &amp; Information</w:t>
+      </w:r>
+      <w:r>
+        <w:t xml:space="preserve">, 40(1), 23–38.</w:t>
+      </w:r>
+    </w:p>
+    <w:p>
+      <w:pPr>
+        <w:spacing w:before="0" w:after="0"/>
+      </w:pPr>
+    </w:p>
+    <w:p>
+      <w:pPr>
+        <w:jc w:val="both"/>
+        <w:spacing w:before="0" w:after="120" w:line="360" w:lineRule="auto"/>
+      </w:pPr>
+      <w:r>
+        <w:t xml:space="preserve">[9] Cruz, M., &amp; Pike, S. (2020). </w:t>
+      </w:r>
+      <w:r>
+        <w:rPr>
+          <w:i/>
+          <w:iCs/>
+        </w:rPr>
+        <w:t xml:space="preserve">Neoplasmatic Design: Design Experimentation with Bio-Architectural Composites</w:t>
+      </w:r>
+      <w:r>
+        <w:t xml:space="preserve">. UCL Press.</w:t>
+      </w:r>
+    </w:p>
+    <w:p>
+      <w:pPr>
+        <w:spacing w:before="0" w:after="0"/>
+      </w:pPr>
+    </w:p>
+    <w:p>
+      <w:pPr>
+        <w:jc w:val="both"/>
+        <w:spacing w:before="0" w:after="120" w:line="360" w:lineRule="auto"/>
+      </w:pPr>
+      <w:r>
+        <w:t xml:space="preserve">[10] Kibert, C. J. (2016). </w:t>
+      </w:r>
+      <w:r>
+        <w:rPr>
+          <w:i/>
+          <w:iCs/>
+        </w:rPr>
+        <w:t xml:space="preserve">Sustainable Construction: Green Building Design and Delivery</w:t>
+      </w:r>
+      <w:r>
+        <w:t xml:space="preserve"> (4th ed.). John Wiley &amp; Sons.</w:t>
+      </w:r>
+    </w:p>
+    <w:p>
+      <w:pPr>
+        <w:spacing w:before="0" w:after="0"/>
+      </w:pPr>
+    </w:p>
+    <w:p>
+      <w:pPr>
+        <w:jc w:val="both"/>
+        <w:spacing w:before="0" w:after="120" w:line="360" w:lineRule="auto"/>
+      </w:pPr>
+      <w:r>
+        <w:t xml:space="preserve">[11] Cole, R. J. (2012). Regenerative design and development: Current theory and practice. </w:t>
+      </w:r>
+      <w:r>
+        <w:rPr>
+          <w:i/>
+          <w:iCs/>
+        </w:rPr>
+        <w:t xml:space="preserve">Building Research &amp; Information</w:t>
+      </w:r>
+      <w:r>
+        <w:t xml:space="preserve">, 40(1), 1–6.</w:t>
+      </w:r>
+    </w:p>
+    <w:p>
+      <w:pPr>
+        <w:spacing w:before="0" w:after="0"/>
+      </w:pPr>
+    </w:p>
+    <w:p>
+      <w:pPr>
+        <w:jc w:val="both"/>
+        <w:spacing w:before="0" w:after="120" w:line="360" w:lineRule="auto"/>
+      </w:pPr>
+      <w:r>
+        <w:t xml:space="preserve">[12] McDonough, W., &amp; Braungart, M. (2002). </w:t>
+      </w:r>
+      <w:r>
+        <w:rPr>
+          <w:i/>
+          <w:iCs/>
+        </w:rPr>
+        <w:t xml:space="preserve">Cradle to Cradle: Remaking the Way We Make Things</w:t>
+      </w:r>
+      <w:r>
+        <w:t xml:space="preserve">. North Point Press.</w:t>
+      </w:r>
+    </w:p>
+    <w:p>
+      <w:pPr>
+        <w:spacing w:before="0" w:after="0"/>
+      </w:pPr>
+    </w:p>
+    <w:p>
+      <w:pPr>
+        <w:jc w:val="both"/>
+        <w:spacing w:before="0" w:after="120" w:line="360" w:lineRule="auto"/>
+      </w:pPr>
+      <w:r>
+        <w:t xml:space="preserve">[13] Lyle, J. T. (1994). </w:t>
+      </w:r>
+      <w:r>
+        <w:rPr>
+          <w:i/>
+          <w:iCs/>
+        </w:rPr>
+        <w:t xml:space="preserve">Regenerative Design for Sustainable Development</w:t>
+      </w:r>
+      <w:r>
+        <w:t xml:space="preserve">. John Wiley &amp; Sons.</w:t>
+      </w:r>
+    </w:p>
+    <w:p>
+      <w:pPr>
+        <w:spacing w:before="0" w:after="0"/>
+      </w:pPr>
+    </w:p>
+    <w:p>
+      <w:pPr>
+        <w:jc w:val="both"/>
+        <w:spacing w:before="0" w:after="120" w:line="360" w:lineRule="auto"/>
+      </w:pPr>
+      <w:r>
+        <w:t xml:space="preserve">[14] du Plessis, C. (2012). Towards a regenerative paradigm for the built environment. </w:t>
+      </w:r>
+      <w:r>
+        <w:rPr>
+          <w:i/>
+          <w:iCs/>
+        </w:rPr>
+        <w:t xml:space="preserve">Building Research &amp; Information</w:t>
+      </w:r>
+      <w:r>
+        <w:t xml:space="preserve">, 40(1), 7–22.</w:t>
+      </w:r>
+    </w:p>
+    <w:p>
+      <w:pPr>
+        <w:spacing w:before="0" w:after="0"/>
+      </w:pPr>
+    </w:p>
+    <w:p>
+      <w:pPr>
+        <w:jc w:val="both"/>
+        <w:spacing w:before="0" w:after="120" w:line="360" w:lineRule="auto"/>
+      </w:pPr>
+      <w:r>
+        <w:t xml:space="preserve">[15] Bellato, L., Frantzeskaki, N., &amp; Brearley, F. Q. (2022). Regenerative tourism: A conceptual framework leveraging theory and practice. </w:t>
+      </w:r>
+      <w:r>
+        <w:rPr>
+          <w:i/>
+          <w:iCs/>
+        </w:rPr>
+        <w:t xml:space="preserve">Tourism Geographies</w:t>
+      </w:r>
+      <w:r>
+        <w:t xml:space="preserve">, 24(6–7), 1026–1046.</w:t>
+      </w:r>
+    </w:p>
+    <w:p>
+      <w:pPr>
+        <w:spacing w:before="0" w:after="0"/>
+      </w:pPr>
+    </w:p>
+    <w:p>
+      <w:pPr>
+        <w:jc w:val="both"/>
+        <w:spacing w:before="0" w:after="120" w:line="360" w:lineRule="auto"/>
+      </w:pPr>
+      <w:r>
+        <w:t xml:space="preserve">[16] Craft, W., Ding, L., Prasad, D., Partridge, L., &amp; Else, D. (2017). Development of a regenerative design model for building retrofits. </w:t>
+      </w:r>
+      <w:r>
+        <w:rPr>
+          <w:i/>
+          <w:iCs/>
+        </w:rPr>
+        <w:t xml:space="preserve">Procedia Engineering</w:t>
+      </w:r>
+      <w:r>
+        <w:t xml:space="preserve">, 180, 658–668.</w:t>
+      </w:r>
+    </w:p>
+    <w:p>
+      <w:pPr>
+        <w:spacing w:before="0" w:after="0"/>
+      </w:pPr>
+    </w:p>
+    <w:p>
+      <w:pPr>
+        <w:jc w:val="both"/>
+        <w:spacing w:before="0" w:after="120" w:line="360" w:lineRule="auto"/>
+      </w:pPr>
+      <w:r>
+        <w:t xml:space="preserve">[17] Frazer, J. (1995). </w:t>
+      </w:r>
+      <w:r>
+        <w:rPr>
+          <w:i/>
+          <w:iCs/>
+        </w:rPr>
+        <w:t xml:space="preserve">An Evolutionary Architecture</w:t>
+      </w:r>
+      <w:r>
+        <w:t xml:space="preserve">. Architectural Association Publications.</w:t>
+      </w:r>
+    </w:p>
+    <w:p>
+      <w:pPr>
+        <w:spacing w:before="0" w:after="0"/>
+      </w:pPr>
+    </w:p>
+    <w:p>
+      <w:pPr>
+        <w:jc w:val="both"/>
+        <w:spacing w:before="0" w:after="120" w:line="360" w:lineRule="auto"/>
+      </w:pPr>
+      <w:r>
+        <w:t xml:space="preserve">[18] Steadman, P. (2008). </w:t>
+      </w:r>
+      <w:r>
+        <w:rPr>
+          <w:i/>
+          <w:iCs/>
+        </w:rPr>
+        <w:t xml:space="preserve">The Evolution of Designs: Biological Analogy in Architecture and the Applied Arts</w:t>
+      </w:r>
+      <w:r>
+        <w:t xml:space="preserve"> (Rev. ed.). Routledge.</w:t>
+      </w:r>
+    </w:p>
+    <w:p>
+      <w:pPr>
+        <w:spacing w:before="0" w:after="0"/>
+      </w:pPr>
+    </w:p>
+    <w:p>
+      <w:pPr>
+        <w:jc w:val="both"/>
+        <w:spacing w:before="0" w:after="120" w:line="360" w:lineRule="auto"/>
+      </w:pPr>
+      <w:r>
+        <w:t xml:space="preserve">[19] Haneef, M., Ceseracciu, L., Canale, C., Bayer, I. S., Heredia-Guerrero, J. A., &amp; Athanassiou, A. (2017). Advanced materials from fungal mycelium: Fabrication and tuning of physical properties. </w:t>
+      </w:r>
+      <w:r>
+        <w:rPr>
+          <w:i/>
+          <w:iCs/>
+        </w:rPr>
+        <w:t xml:space="preserve">Scientific Reports</w:t>
+      </w:r>
+      <w:r>
+        <w:t xml:space="preserve">, 7, 41292.</w:t>
+      </w:r>
+    </w:p>
+    <w:p>
+      <w:pPr>
+        <w:spacing w:before="0" w:after="0"/>
+      </w:pPr>
+    </w:p>
+    <w:p>
+      <w:pPr>
+        <w:jc w:val="both"/>
+        <w:spacing w:before="0" w:after="120" w:line="360" w:lineRule="auto"/>
+      </w:pPr>
+      <w:r>
+        <w:t xml:space="preserve">[20] Jones, M., Mautner, A., Luenco, S., Bismarck, A., &amp; John, S. (2020). Engineered mycelium composite construction materials from fungal biorefineries: A critical review. </w:t>
+      </w:r>
+      <w:r>
+        <w:rPr>
+          <w:i/>
+          <w:iCs/>
+        </w:rPr>
+        <w:t xml:space="preserve">Materials &amp; Design</w:t>
+      </w:r>
+      <w:r>
+        <w:t xml:space="preserve">, 187, 108397.</w:t>
+      </w:r>
+    </w:p>
+    <w:p>
+      <w:pPr>
+        <w:spacing w:before="0" w:after="0"/>
+      </w:pPr>
+    </w:p>
+    <w:p>
+      <w:pPr>
+        <w:jc w:val="both"/>
+        <w:spacing w:before="0" w:after="120" w:line="360" w:lineRule="auto"/>
+      </w:pPr>
+      <w:r>
+        <w:t xml:space="preserve">[21] Elsacker, E., Vandelook, S., Van Wylick, A., Ruytinx, J., De Laet, L., &amp; Peeters, E. (2021). A comprehensive framework for the production of mycelium-based lignocellulosic composites. </w:t>
+      </w:r>
+      <w:r>
+        <w:rPr>
+          <w:i/>
+          <w:iCs/>
+        </w:rPr>
+        <w:t xml:space="preserve">Science of the Total Environment</w:t>
+      </w:r>
+      <w:r>
+        <w:t xml:space="preserve">, 725, 138431.</w:t>
+      </w:r>
+    </w:p>
+    <w:p>
+      <w:pPr>
+        <w:spacing w:before="0" w:after="0"/>
+      </w:pPr>
+    </w:p>
+    <w:p>
+      <w:pPr>
+        <w:jc w:val="both"/>
+        <w:spacing w:before="0" w:after="120" w:line="360" w:lineRule="auto"/>
+      </w:pPr>
+      <w:r>
+        <w:t xml:space="preserve">[22] Wilkinson, S., Stoller, P., Ralph, P., Hamdorf, B., Franber, L. N., &amp; Morel, A. (2017). Exploring the feasibility of algae building technology in NSW. </w:t>
+      </w:r>
+      <w:r>
+        <w:rPr>
+          <w:i/>
+          <w:iCs/>
+        </w:rPr>
+        <w:t xml:space="preserve">Procedia Engineering</w:t>
+      </w:r>
+      <w:r>
+        <w:t xml:space="preserve">, 180, 1121–1130.</w:t>
+      </w:r>
+    </w:p>
+    <w:p>
+      <w:pPr>
+        <w:spacing w:before="0" w:after="0"/>
+      </w:pPr>
+    </w:p>
+    <w:p>
+      <w:pPr>
+        <w:jc w:val="both"/>
+        <w:spacing w:before="0" w:after="120" w:line="360" w:lineRule="auto"/>
+      </w:pPr>
+      <w:r>
+        <w:t xml:space="preserve">[23] Cervera Sardá, R., &amp; Vicente, J. (2020). Case study on the optimization of algae photobioreactor facades for building energy performance. </w:t>
+      </w:r>
+      <w:r>
+        <w:rPr>
+          <w:i/>
+          <w:iCs/>
+        </w:rPr>
+        <w:t xml:space="preserve">Journal of Facade Design and Engineering</w:t>
+      </w:r>
+      <w:r>
+        <w:t xml:space="preserve">, 8(1), 1–22.</w:t>
+      </w:r>
+    </w:p>
+    <w:p>
+      <w:pPr>
+        <w:spacing w:before="0" w:after="0"/>
+      </w:pPr>
+    </w:p>
+    <w:p>
+      <w:pPr>
+        <w:jc w:val="both"/>
+        <w:spacing w:before="0" w:after="120" w:line="360" w:lineRule="auto"/>
+      </w:pPr>
+      <w:r>
+        <w:t xml:space="preserve">[24] Ludwig, F., Middleton, W., Gallenmüller, F., Rogers, P., &amp; Speck, T. (2019). Living bridges using aerial roots of Ficus elastica—An interdisciplinary perspective. </w:t>
+      </w:r>
+      <w:r>
+        <w:rPr>
+          <w:i/>
+          <w:iCs/>
+        </w:rPr>
+        <w:t xml:space="preserve">Scientific Reports</w:t>
+      </w:r>
+      <w:r>
+        <w:t xml:space="preserve">, 9, 12226.</w:t>
+      </w:r>
+    </w:p>
+    <w:p>
+      <w:pPr>
+        <w:spacing w:before="0" w:after="0"/>
+      </w:pPr>
+    </w:p>
+    <w:p>
+      <w:pPr>
+        <w:jc w:val="both"/>
+        <w:spacing w:before="0" w:after="120" w:line="360" w:lineRule="auto"/>
+      </w:pPr>
+      <w:r>
+        <w:t xml:space="preserve">[25] Shea, K., Aish, R., &amp; Gourtovaia, M. (2005). Towards integrated performance-driven generative design tools. </w:t>
+      </w:r>
+      <w:r>
+        <w:rPr>
+          <w:i/>
+          <w:iCs/>
+        </w:rPr>
+        <w:t xml:space="preserve">Automation in Construction</w:t>
+      </w:r>
+      <w:r>
+        <w:t xml:space="preserve">, 14(2), 253–264.</w:t>
+      </w:r>
+    </w:p>
+    <w:p>
+      <w:pPr>
+        <w:spacing w:before="0" w:after="0"/>
+      </w:pPr>
+    </w:p>
+    <w:p>
+      <w:pPr>
+        <w:jc w:val="both"/>
+        <w:spacing w:before="0" w:after="120" w:line="360" w:lineRule="auto"/>
+      </w:pPr>
+      <w:r>
+        <w:t xml:space="preserve">[26] Oxman, N. (2010). </w:t>
+      </w:r>
+      <w:r>
+        <w:rPr>
+          <w:i/>
+          <w:iCs/>
+        </w:rPr>
+        <w:t xml:space="preserve">Material-Based Design Computation</w:t>
+      </w:r>
+      <w:r>
+        <w:t xml:space="preserve"> [Doctoral dissertation, Massachusetts Institute of Technology]. MIT Libraries.</w:t>
+      </w:r>
+    </w:p>
+    <w:p>
+      <w:pPr>
+        <w:spacing w:before="0" w:after="0"/>
+      </w:pPr>
+    </w:p>
+    <w:p>
+      <w:pPr>
+        <w:jc w:val="both"/>
+        <w:spacing w:before="0" w:after="120" w:line="360" w:lineRule="auto"/>
+      </w:pPr>
+      <w:r>
+        <w:t xml:space="preserve">[27] Colding, J., Giusti, M., Haga, A., Wallhagen, M., &amp; Barthel, S. (2020). Enabling relationships with nature in cities. </w:t>
+      </w:r>
+      <w:r>
+        <w:rPr>
+          <w:i/>
+          <w:iCs/>
+        </w:rPr>
+        <w:t xml:space="preserve">Sustainability</w:t>
+      </w:r>
+      <w:r>
+        <w:t xml:space="preserve">, 12(11), 4394.</w:t>
+      </w:r>
+    </w:p>
+    <w:p>
+      <w:pPr>
+        <w:spacing w:before="0" w:after="0"/>
+      </w:pPr>
+    </w:p>
+    <w:p>
+      <w:pPr>
+        <w:jc w:val="both"/>
+        <w:spacing w:before="0" w:after="120" w:line="360" w:lineRule="auto"/>
+      </w:pPr>
+      <w:r>
+        <w:t xml:space="preserve">[28] Grimm, V., &amp; Railsback, S. F. (2005). </w:t>
+      </w:r>
+      <w:r>
+        <w:rPr>
+          <w:i/>
+          <w:iCs/>
+        </w:rPr>
+        <w:t xml:space="preserve">Individual-Based Modeling and Ecology</w:t>
+      </w:r>
+      <w:r>
+        <w:t xml:space="preserve">. Princeton University Press.</w:t>
+      </w:r>
+    </w:p>
+    <w:p>
+      <w:pPr>
+        <w:spacing w:before="0" w:after="0"/>
+      </w:pPr>
+    </w:p>
+    <w:p>
+      <w:pPr>
+        <w:jc w:val="both"/>
+        <w:spacing w:before="0" w:after="120" w:line="360" w:lineRule="auto"/>
+      </w:pPr>
+      <w:r>
+        <w:t xml:space="preserve">[29] Apfelbeck, B., Snep, R. P., Hauck, T. E., Ferguson, J., Holy, M., Jakoby, C., MacIvor, J. S., &amp; Weisser, W. W. (2020). Designing wildlife-inclusive cities that support human-animal co-existence. </w:t>
+      </w:r>
+      <w:r>
+        <w:rPr>
+          <w:i/>
+          <w:iCs/>
+        </w:rPr>
+        <w:t xml:space="preserve">Landscape and Urban Planning</w:t>
+      </w:r>
+      <w:r>
+        <w:t xml:space="preserve">, 200, 103817.</w:t>
+      </w:r>
+    </w:p>
+    <w:p>
+      <w:pPr>
+        <w:spacing w:before="0" w:after="0"/>
+      </w:pPr>
+    </w:p>
+    <w:p>
+      <w:pPr>
+        <w:jc w:val="both"/>
+        <w:spacing w:before="0" w:after="120" w:line="360" w:lineRule="auto"/>
+      </w:pPr>
+      <w:r>
+        <w:t xml:space="preserve">[30] Reichstein, M., Camps-Valls, G., Stevens, B., Jung, M., Denzler, J., Carvalhais, N., &amp; Prabhat. (2019). Deep learning and process understanding for data-driven Earth system science. </w:t>
+      </w:r>
+      <w:r>
+        <w:rPr>
+          <w:i/>
+          <w:iCs/>
+        </w:rPr>
+        <w:t xml:space="preserve">Nature</w:t>
+      </w:r>
+      <w:r>
+        <w:t xml:space="preserve">, 566(7743), 195–204.</w:t>
+      </w:r>
+    </w:p>
+    <w:p>
+      <w:pPr>
+        <w:spacing w:before="0" w:after="0"/>
+      </w:pPr>
+    </w:p>
+    <w:p>
+      <w:pPr>
+        <w:jc w:val="both"/>
+        <w:spacing w:before="0" w:after="120" w:line="360" w:lineRule="auto"/>
+      </w:pPr>
+      <w:r>
+        <w:t xml:space="preserve">[31] Kimmerer, R. W. (2013). </w:t>
+      </w:r>
+      <w:r>
+        <w:rPr>
+          <w:i/>
+          <w:iCs/>
+        </w:rPr>
+        <w:t xml:space="preserve">Braiding Sweetgrass: Indigenous Wisdom, Scientific Knowledge, and the Teachings of Plants</w:t>
+      </w:r>
+      <w:r>
+        <w:t xml:space="preserve">. Milkweed Editions.</w:t>
+      </w:r>
+    </w:p>
+    <w:p>
+      <w:pPr>
+        <w:spacing w:before="0" w:after="0"/>
+      </w:pPr>
+    </w:p>
+    <w:p>
+      <w:pPr>
+        <w:jc w:val="both"/>
+        <w:spacing w:before="0" w:after="120" w:line="360" w:lineRule="auto"/>
+      </w:pPr>
+      <w:r>
+        <w:t xml:space="preserve">[32] Tengö, M., Brondizio, E. S., Elmqvist, T., Malmer, P., &amp; Spierenburg, M. (2014). Connecting diverse knowledge systems for enhanced ecosystem governance: The multiple evidence base approach. </w:t>
+      </w:r>
+      <w:r>
+        <w:rPr>
+          <w:i/>
+          <w:iCs/>
+        </w:rPr>
+        <w:t xml:space="preserve">Ambio</w:t>
+      </w:r>
+      <w:r>
+        <w:t xml:space="preserve">, 43(5), 579–591.</w:t>
+      </w:r>
+    </w:p>
+    <w:p>
+      <w:pPr>
+        <w:spacing w:before="0" w:after="0"/>
+      </w:pPr>
+    </w:p>
+    <w:p>
+      <w:pPr>
+        <w:jc w:val="both"/>
+        <w:spacing w:before="0" w:after="120" w:line="360" w:lineRule="auto"/>
+      </w:pPr>
+      <w:r>
+        <w:t xml:space="preserve">[33] Davidson-Hunt, I. J., Turner, K. L., Mead, A. T. P., Cabrera-Lopez, J., Bolton, R., Idrobo, C. J., Miretski, I., Morrison, A., &amp; Robson, J. P. (2012). Biocultural design: A new conceptual framework for sustainable development in rural indigenous and local communities. </w:t>
+      </w:r>
+      <w:r>
+        <w:rPr>
+          <w:i/>
+          <w:iCs/>
+        </w:rPr>
+        <w:t xml:space="preserve">SAPIENS</w:t>
+      </w:r>
+      <w:r>
+        <w:t xml:space="preserve">, 5(2), 33–45.</w:t>
+      </w:r>
+    </w:p>
+    <w:p>
+      <w:pPr>
+        <w:spacing w:before="0" w:after="0"/>
+      </w:pPr>
+    </w:p>
+    <w:p>
+      <w:pPr>
+        <w:jc w:val="both"/>
+        <w:spacing w:before="0" w:after="120" w:line="360" w:lineRule="auto"/>
+      </w:pPr>
+      <w:r>
+        <w:t xml:space="preserve">[34] Tlostanova, M. (2017). On decolonizing design. </w:t>
+      </w:r>
+      <w:r>
+        <w:rPr>
+          <w:i/>
+          <w:iCs/>
+        </w:rPr>
+        <w:t xml:space="preserve">Design Philosophy Papers</w:t>
+      </w:r>
+      <w:r>
+        <w:t xml:space="preserve">, 15(1), 51–61.</w:t>
+      </w:r>
+    </w:p>
+    <w:p>
+      <w:pPr>
+        <w:spacing w:before="0" w:after="0"/>
+      </w:pPr>
+    </w:p>
+    <w:p>
+      <w:pPr>
+        <w:jc w:val="both"/>
+        <w:spacing w:before="0" w:after="120" w:line="360" w:lineRule="auto"/>
+      </w:pPr>
+      <w:r>
+        <w:t xml:space="preserve">[35] Creswell, J. W., &amp; Plano Clark, V. L. (2018). </w:t>
+      </w:r>
+      <w:r>
+        <w:rPr>
+          <w:i/>
+          <w:iCs/>
+        </w:rPr>
+        <w:t xml:space="preserve">Designing and Conducting Mixed Methods Research</w:t>
+      </w:r>
+      <w:r>
+        <w:t xml:space="preserve"> (3rd ed.). SAGE.</w:t>
+      </w:r>
+    </w:p>
+    <w:p>
+      <w:pPr>
+        <w:spacing w:before="0" w:after="0"/>
+      </w:pPr>
+    </w:p>
+    <w:p>
+      <w:pPr>
+        <w:jc w:val="both"/>
+        <w:spacing w:before="0" w:after="120" w:line="360" w:lineRule="auto"/>
+      </w:pPr>
+      <w:r>
+        <w:t xml:space="preserve">[36] Dikec, J., Olivier, A., Bobée, C., D'Angelo, Y., Janel, R., Brunet, A. B., Douady, S., &amp; Brun, C. (2021). Hyphal network whole field imaging allows for accurate estimation of anastomosis rates and hyphal growth parameters. </w:t>
+      </w:r>
+      <w:r>
+        <w:rPr>
+          <w:i/>
+          <w:iCs/>
+        </w:rPr>
+        <w:t xml:space="preserve">Scientific Reports</w:t>
+      </w:r>
+      <w:r>
+        <w:t xml:space="preserve">, 10, 3131.</w:t>
+      </w:r>
+    </w:p>
+    <w:p>
+      <w:pPr>
+        <w:spacing w:before="0" w:after="0"/>
+      </w:pPr>
+    </w:p>
+    <w:p>
+      <w:pPr>
+        <w:jc w:val="both"/>
+        <w:spacing w:before="0" w:after="120" w:line="360" w:lineRule="auto"/>
+      </w:pPr>
+      <w:r>
+        <w:t xml:space="preserve">[37] McRae, B. H., Dickson, B. G., Keitt, T. H., &amp; Shah, V. B. (2008). Using circuit theory to model connectivity in ecology, evolution, and conservation. </w:t>
+      </w:r>
+      <w:r>
+        <w:rPr>
+          <w:i/>
+          <w:iCs/>
+        </w:rPr>
+        <w:t xml:space="preserve">Ecology</w:t>
+      </w:r>
+      <w:r>
+        <w:t xml:space="preserve">, 89(10), 2712–2724.</w:t>
+      </w:r>
+    </w:p>
+    <w:p>
+      <w:pPr>
+        <w:spacing w:before="0" w:after="0"/>
+      </w:pPr>
+    </w:p>
+    <w:p>
+      <w:pPr>
+        <w:jc w:val="both"/>
+        <w:spacing w:before="0" w:after="120" w:line="360" w:lineRule="auto"/>
+      </w:pPr>
+      <w:r>
+        <w:t xml:space="preserve">[38] Yin, R. K. (2018). </w:t>
+      </w:r>
+      <w:r>
+        <w:rPr>
+          <w:i/>
+          <w:iCs/>
+        </w:rPr>
+        <w:t xml:space="preserve">Case Study Research and Applications: Design and Methods</w:t>
+      </w:r>
+      <w:r>
+        <w:t xml:space="preserve"> (6th ed.). SAGE.</w:t>
+      </w:r>
+    </w:p>
+    <w:p>
+      <w:pPr>
+        <w:spacing w:before="0" w:after="0"/>
+      </w:pPr>
+    </w:p>
+    <w:p>
+      <w:pPr>
+        <w:jc w:val="both"/>
+        <w:spacing w:before="0" w:after="120" w:line="360" w:lineRule="auto"/>
+      </w:pPr>
+      <w:r>
+        <w:t xml:space="preserve">[39] Haines-Young, R., &amp; Potschin, M. B. (2018). </w:t>
+      </w:r>
+      <w:r>
+        <w:rPr>
+          <w:i/>
+          <w:iCs/>
+        </w:rPr>
+        <w:t xml:space="preserve">Common International Classification of Ecosystem Services (CICES) V5.1: Guidance on the Application of the Revised Structure</w:t>
+      </w:r>
+      <w:r>
+        <w:t xml:space="preserve">. European Environment Agency.</w:t>
+      </w:r>
+    </w:p>
+    <w:p>
+      <w:pPr>
+        <w:spacing w:before="0" w:after="0"/>
+      </w:pPr>
+    </w:p>
+    <w:p>
+      <w:pPr>
+        <w:jc w:val="both"/>
+        <w:spacing w:before="0" w:after="120" w:line="360" w:lineRule="auto"/>
+      </w:pPr>
+      <w:r>
+        <w:t xml:space="preserve">[40] de Groot, R., Brander, L., van der Ploeg, S., Costanza, R., Bernard, F., Braat, L., Christie, M., Crossman, N., Ghermandi, A., Hein, L., Hussain, S., Kumar, P., McVittie, A., Portela, R., Rodriguez, L. C., ten Brink, P., &amp; van Beukering, P. (2012). Global estimates of the value of ecosystems and their services in monetary units. </w:t>
       </w:r>
       <w:r>
         <w:rPr>
@@ -3353,625 +4018,151 @@
         <w:t xml:space="preserve">Ecosystem Services</w:t>
       </w:r>
       <w:r>
-        <w:t xml:space="preserve">, </w:t>
-      </w:r>
-      <w:r>
-        <w:rPr>
-          <w:i/>
-          <w:iCs/>
-        </w:rPr>
-        <w:t xml:space="preserve">1</w:t>
-      </w:r>
-      <w:r>
-        <w:t xml:space="preserve">(1), 50–61. https://doi.org/10.1016/j.ecoser.2012.07.005</w:t>
-      </w:r>
-    </w:p>
-    <w:p>
-      <w:pPr>
-        <w:spacing w:before="0" w:after="0"/>
-      </w:pPr>
-    </w:p>
-    <w:p>
-      <w:pPr>
-        <w:ind w:left="720"/>
-        <w:spacing w:before="0" w:after="80" w:line="360" w:lineRule="auto"/>
-      </w:pPr>
-      <w:r>
-        <w:rPr>
-          <w:sz w:val="22"/>
-          <w:szCs w:val="22"/>
-        </w:rPr>
-        <w:t xml:space="preserve">Dikec, J., Olivier, A., Bobée, C., D'Angelo, Y., Janel, R., Brunet, A. B., Douady, S., &amp; Brun, C. (2021). Hyphal network whole field imaging allows for accurate estimation of anastomosis rates and hyphal growth parameters. Scientific Reports, 10, 3131. https://doi.org/10.1038/s41598-020-57809-5</w:t>
-      </w:r>
-    </w:p>
-    <w:p>
-      <w:pPr>
-        <w:spacing w:before="0" w:after="0"/>
-      </w:pPr>
-    </w:p>
-    <w:p>
-      <w:pPr>
-        <w:jc w:val="both"/>
-        <w:spacing w:before="0" w:after="120" w:line="360" w:lineRule="auto"/>
-      </w:pPr>
-      <w:r>
-        <w:t xml:space="preserve">du Plessis, C. (2012). Towards a regenerative paradigm for the built environment. </w:t>
-      </w:r>
-      <w:r>
-        <w:rPr>
-          <w:i/>
-          <w:iCs/>
-        </w:rPr>
-        <w:t xml:space="preserve">Building Research &amp; Information</w:t>
-      </w:r>
-      <w:r>
-        <w:t xml:space="preserve">, </w:t>
-      </w:r>
-      <w:r>
-        <w:rPr>
-          <w:i/>
-          <w:iCs/>
-        </w:rPr>
-        <w:t xml:space="preserve">40</w:t>
-      </w:r>
-      <w:r>
-        <w:t xml:space="preserve">(1), 7–22. https://doi.org/10.1080/09613218.2012.628548</w:t>
-      </w:r>
-    </w:p>
-    <w:p>
-      <w:pPr>
-        <w:spacing w:before="0" w:after="0"/>
-      </w:pPr>
-    </w:p>
-    <w:p>
-      <w:pPr>
-        <w:ind w:left="720"/>
-        <w:spacing w:before="0" w:after="80" w:line="360" w:lineRule="auto"/>
-      </w:pPr>
-      <w:r>
-        <w:rPr>
-          <w:sz w:val="22"/>
-          <w:szCs w:val="22"/>
-        </w:rPr>
-        <w:t xml:space="preserve">Elsacker, E., Vandelook, S., Van Wylick, A., Ruytinx, J., De Laet, L., &amp; Peeters, E. (2021). A comprehensive framework for the production of mycelium-based lignocellulosic composites. Science of the Total Environment, 725, 138431. https://doi.org/10.1016/j.scitotenv.2020.138431</w:t>
-      </w:r>
-    </w:p>
-    <w:p>
-      <w:pPr>
-        <w:spacing w:before="0" w:after="0"/>
-      </w:pPr>
-    </w:p>
-    <w:p>
-      <w:pPr>
-        <w:ind w:left="720"/>
-        <w:spacing w:before="0" w:after="80" w:line="360" w:lineRule="auto"/>
-      </w:pPr>
-      <w:r>
-        <w:rPr>
-          <w:sz w:val="22"/>
-          <w:szCs w:val="22"/>
-        </w:rPr>
-        <w:t xml:space="preserve">Frazer, J. (1995). An evolutionary architecture. Architectural Association Publications.</w:t>
-      </w:r>
-    </w:p>
-    <w:p>
-      <w:pPr>
-        <w:spacing w:before="0" w:after="0"/>
-      </w:pPr>
-    </w:p>
-    <w:p>
-      <w:pPr>
-        <w:ind w:left="720"/>
-        <w:spacing w:before="0" w:after="80" w:line="360" w:lineRule="auto"/>
-      </w:pPr>
-      <w:r>
-        <w:rPr>
-          <w:sz w:val="22"/>
-          <w:szCs w:val="22"/>
-        </w:rPr>
-        <w:t xml:space="preserve">Gilbert, C., &amp; Ellis, T. (2019). Biological engineered living materials: Growing functional materials with genetically programmable properties. ACS Synthetic Biology, 8(1), 1–15. https://doi.org/10.1021/acssynbio.8b00423</w:t>
-      </w:r>
-    </w:p>
-    <w:p>
-      <w:pPr>
-        <w:spacing w:before="0" w:after="0"/>
-      </w:pPr>
-    </w:p>
-    <w:p>
-      <w:pPr>
-        <w:jc w:val="both"/>
-        <w:spacing w:before="0" w:after="120" w:line="360" w:lineRule="auto"/>
-      </w:pPr>
-      <w:r>
-        <w:t xml:space="preserve">Gössling, S., &amp; Peeters, P. (2015). Assessing tourism's global environmental impact 1900–2050. </w:t>
-      </w:r>
-      <w:r>
-        <w:rPr>
-          <w:i/>
-          <w:iCs/>
-        </w:rPr>
-        <w:t xml:space="preserve">Journal of Sustainable Tourism</w:t>
-      </w:r>
-      <w:r>
-        <w:t xml:space="preserve">, </w:t>
-      </w:r>
-      <w:r>
-        <w:rPr>
-          <w:i/>
-          <w:iCs/>
-        </w:rPr>
-        <w:t xml:space="preserve">23</w:t>
-      </w:r>
-      <w:r>
-        <w:t xml:space="preserve">(5), 639–659. https://doi.org/10.1080/09669582.2015.1008500</w:t>
-      </w:r>
-    </w:p>
-    <w:p>
-      <w:pPr>
-        <w:spacing w:before="0" w:after="0"/>
-      </w:pPr>
-    </w:p>
-    <w:p>
-      <w:pPr>
-        <w:ind w:left="720"/>
-        <w:spacing w:before="0" w:after="80" w:line="360" w:lineRule="auto"/>
-      </w:pPr>
-      <w:r>
-        <w:rPr>
-          <w:sz w:val="22"/>
-          <w:szCs w:val="22"/>
-        </w:rPr>
-        <w:t xml:space="preserve">Grimm, V., &amp; Railsback, S. F. (2005). Individual-based modeling and ecology. Princeton University Press.</w:t>
-      </w:r>
-    </w:p>
-    <w:p>
-      <w:pPr>
-        <w:spacing w:before="0" w:after="0"/>
-      </w:pPr>
-    </w:p>
-    <w:p>
-      <w:pPr>
-        <w:ind w:left="720"/>
-        <w:spacing w:before="0" w:after="80" w:line="360" w:lineRule="auto"/>
-      </w:pPr>
-      <w:r>
-        <w:rPr>
-          <w:sz w:val="22"/>
-          <w:szCs w:val="22"/>
-        </w:rPr>
-        <w:t xml:space="preserve">Haines-Young, R., &amp; Potschin, M. B. (2018). Common international classification of ecosystem services (CICES) V5.1: Guidance on the application of the revised structure. European Environment Agency.</w:t>
-      </w:r>
-    </w:p>
-    <w:p>
-      <w:pPr>
-        <w:spacing w:before="0" w:after="0"/>
-      </w:pPr>
-    </w:p>
-    <w:p>
-      <w:pPr>
-        <w:ind w:left="720"/>
-        <w:spacing w:before="0" w:after="80" w:line="360" w:lineRule="auto"/>
-      </w:pPr>
-      <w:r>
-        <w:rPr>
-          <w:sz w:val="22"/>
-          <w:szCs w:val="22"/>
-        </w:rPr>
-        <w:t xml:space="preserve">Haneef, M., Ceseracciu, L., Canale, C., Bayer, I. S., Heredia-Guerrero, J. A., &amp; Athanassiou, A. (2017). Advanced materials from fungal mycelium: Fabrication and tuning of physical properties. Scientific Reports, 7, 41292. https://doi.org/10.1038/srep41292</w:t>
-      </w:r>
-    </w:p>
-    <w:p>
-      <w:pPr>
-        <w:spacing w:before="0" w:after="0"/>
-      </w:pPr>
-    </w:p>
-    <w:p>
-      <w:pPr>
-        <w:ind w:left="720"/>
-        <w:spacing w:before="0" w:after="80" w:line="360" w:lineRule="auto"/>
-      </w:pPr>
-      <w:r>
-        <w:rPr>
-          <w:sz w:val="22"/>
-          <w:szCs w:val="22"/>
-        </w:rPr>
-        <w:t xml:space="preserve">Hao, M., Qiao, J., Qi, H., &amp; Liu, S. (2022). Microbially induced calcite precipitation for concrete protection—A review. Journal of Building Engineering, 56, 104731. https://doi.org/10.1016/j.jobe.2022.104731</w:t>
-      </w:r>
-    </w:p>
-    <w:p>
-      <w:pPr>
-        <w:spacing w:before="0" w:after="0"/>
-      </w:pPr>
-    </w:p>
-    <w:p>
-      <w:pPr>
-        <w:ind w:left="720"/>
-        <w:spacing w:before="0" w:after="80" w:line="360" w:lineRule="auto"/>
-      </w:pPr>
-      <w:r>
-        <w:rPr>
-          <w:sz w:val="22"/>
-          <w:szCs w:val="22"/>
-        </w:rPr>
-        <w:t xml:space="preserve">Higgins-Desbiolles, F. (2018). Sustainable tourism: Sustaining tourism or something more? Tourism Management Perspectives, 25, 157–160. https://doi.org/10.1016/j.tmp.2017.11.017</w:t>
-      </w:r>
-    </w:p>
-    <w:p>
-      <w:pPr>
-        <w:spacing w:before="0" w:after="0"/>
-      </w:pPr>
-    </w:p>
-    <w:p>
-      <w:pPr>
-        <w:ind w:left="720"/>
-        <w:spacing w:before="0" w:after="80" w:line="360" w:lineRule="auto"/>
-      </w:pPr>
-      <w:r>
-        <w:rPr>
-          <w:sz w:val="22"/>
-          <w:szCs w:val="22"/>
-        </w:rPr>
-        <w:t xml:space="preserve">Jones, M., Mautner, A., Luenco, S., Bismarck, A., &amp; John, S. (2020). Engineered mycelium composite construction materials from fungal biorefineries: A critical review. Materials &amp; Design, 187, 108397. https://doi.org/10.1016/j.matdes.2019.108397</w:t>
-      </w:r>
-    </w:p>
-    <w:p>
-      <w:pPr>
-        <w:spacing w:before="0" w:after="0"/>
-      </w:pPr>
-    </w:p>
-    <w:p>
-      <w:pPr>
-        <w:ind w:left="720"/>
-        <w:spacing w:before="0" w:after="80" w:line="360" w:lineRule="auto"/>
-      </w:pPr>
-      <w:r>
-        <w:rPr>
-          <w:sz w:val="22"/>
-          <w:szCs w:val="22"/>
-        </w:rPr>
-        <w:t xml:space="preserve">Kibert, C. J. (2016). Sustainable construction: Green building design and delivery (4th ed.). John Wiley &amp; Sons.</w:t>
-      </w:r>
-    </w:p>
-    <w:p>
-      <w:pPr>
-        <w:spacing w:before="0" w:after="0"/>
-      </w:pPr>
-    </w:p>
-    <w:p>
-      <w:pPr>
-        <w:ind w:left="720"/>
-        <w:spacing w:before="0" w:after="80" w:line="360" w:lineRule="auto"/>
-      </w:pPr>
-      <w:r>
-        <w:rPr>
-          <w:sz w:val="22"/>
-          <w:szCs w:val="22"/>
-        </w:rPr>
-        <w:t xml:space="preserve">Kimmerer, R. W. (2013). Braiding sweetgrass: Indigenous wisdom, scientific knowledge, and the teachings of plants. Milkweed Editions.</w:t>
-      </w:r>
-    </w:p>
-    <w:p>
-      <w:pPr>
-        <w:spacing w:before="0" w:after="0"/>
-      </w:pPr>
-    </w:p>
-    <w:p>
-      <w:pPr>
-        <w:ind w:left="720"/>
-        <w:spacing w:before="0" w:after="80" w:line="360" w:lineRule="auto"/>
-      </w:pPr>
-      <w:r>
-        <w:rPr>
-          <w:sz w:val="22"/>
-          <w:szCs w:val="22"/>
-        </w:rPr>
-        <w:t xml:space="preserve">Lenzen, M., Sun, Y. Y., Faturay, F., Ting, Y. P., Geschke, A., &amp; Malik, A. (2018). The carbon footprint of global tourism. Nature Climate Change, 8(6), 522–528. https://doi.org/10.1038/s41558-018-0141-x</w:t>
-      </w:r>
-    </w:p>
-    <w:p>
-      <w:pPr>
-        <w:spacing w:before="0" w:after="0"/>
-      </w:pPr>
-    </w:p>
-    <w:p>
-      <w:pPr>
-        <w:ind w:left="720"/>
-        <w:spacing w:before="0" w:after="80" w:line="360" w:lineRule="auto"/>
-      </w:pPr>
-      <w:r>
-        <w:rPr>
-          <w:sz w:val="22"/>
-          <w:szCs w:val="22"/>
-        </w:rPr>
-        <w:t xml:space="preserve">Ludwig, F., Middleton, W., Gallenmüller, F., Rogers, P., &amp; Speck, T. (2019). Living bridges using aerial roots of Ficus elastica—An interdisciplinary perspective. Scientific Reports, 9, 12226. https://doi.org/10.1038/s41598-019-48652-w</w:t>
-      </w:r>
-    </w:p>
-    <w:p>
-      <w:pPr>
-        <w:spacing w:before="0" w:after="0"/>
-      </w:pPr>
-    </w:p>
-    <w:p>
-      <w:pPr>
-        <w:ind w:left="720"/>
-        <w:spacing w:before="0" w:after="80" w:line="360" w:lineRule="auto"/>
-      </w:pPr>
-      <w:r>
-        <w:rPr>
-          <w:sz w:val="22"/>
-          <w:szCs w:val="22"/>
-        </w:rPr>
-        <w:t xml:space="preserve">Lyle, J. T. (1994). Regenerative design for sustainable development. John Wiley &amp; Sons.</w:t>
-      </w:r>
-    </w:p>
-    <w:p>
-      <w:pPr>
-        <w:spacing w:before="0" w:after="0"/>
-      </w:pPr>
-    </w:p>
-    <w:p>
-      <w:pPr>
-        <w:ind w:left="720"/>
-        <w:spacing w:before="0" w:after="80" w:line="360" w:lineRule="auto"/>
-      </w:pPr>
-      <w:r>
-        <w:rPr>
-          <w:sz w:val="22"/>
-          <w:szCs w:val="22"/>
-        </w:rPr>
-        <w:t xml:space="preserve">Mang, P., &amp; Reed, B. (2012). Designing from place: A regenerative framework and methodology. Building Research &amp; Information, 40(1), 23–38. https://doi.org/10.1080/09613218.2012.621341</w:t>
-      </w:r>
-    </w:p>
-    <w:p>
-      <w:pPr>
-        <w:spacing w:before="0" w:after="0"/>
-      </w:pPr>
-    </w:p>
-    <w:p>
-      <w:pPr>
-        <w:ind w:left="720"/>
-        <w:spacing w:before="0" w:after="80" w:line="360" w:lineRule="auto"/>
-      </w:pPr>
-      <w:r>
-        <w:rPr>
-          <w:sz w:val="22"/>
-          <w:szCs w:val="22"/>
-        </w:rPr>
-        <w:t xml:space="preserve">McDonough, W., &amp; Braungart, M. (2002). Cradle to cradle: Remaking the way we make things. North Point Press.</w:t>
-      </w:r>
-    </w:p>
-    <w:p>
-      <w:pPr>
-        <w:spacing w:before="0" w:after="0"/>
-      </w:pPr>
-    </w:p>
-    <w:p>
-      <w:pPr>
-        <w:ind w:left="720"/>
-        <w:spacing w:before="0" w:after="80" w:line="360" w:lineRule="auto"/>
-      </w:pPr>
-      <w:r>
-        <w:rPr>
-          <w:sz w:val="22"/>
-          <w:szCs w:val="22"/>
-        </w:rPr>
-        <w:t xml:space="preserve">McRae, B. H., Dickson, B. G., Keitt, T. H., &amp; Shah, V. B. (2008). Using circuit theory to model connectivity in ecology, evolution, and conservation. Ecology, 89(10), 2712–2724. https://doi.org/10.1890/07-1861.1</w:t>
-      </w:r>
-    </w:p>
-    <w:p>
-      <w:pPr>
-        <w:spacing w:before="0" w:after="0"/>
-      </w:pPr>
-    </w:p>
-    <w:p>
-      <w:pPr>
-        <w:ind w:left="720"/>
-        <w:spacing w:before="0" w:after="80" w:line="360" w:lineRule="auto"/>
-      </w:pPr>
-      <w:r>
-        <w:rPr>
-          <w:sz w:val="22"/>
-          <w:szCs w:val="22"/>
-        </w:rPr>
-        <w:t xml:space="preserve">Menges, A., &amp; Reichert, S. (2015). Performative wood: Physically programming the responsive architecture of the HygroScope and HygroSkin projects. Architectural Design, 85(5), 66–73. https://doi.org/10.1002/ad.1956</w:t>
-      </w:r>
-    </w:p>
-    <w:p>
-      <w:pPr>
-        <w:spacing w:before="0" w:after="0"/>
-      </w:pPr>
-    </w:p>
-    <w:p>
-      <w:pPr>
-        <w:ind w:left="720"/>
-        <w:spacing w:before="0" w:after="80" w:line="360" w:lineRule="auto"/>
-      </w:pPr>
-      <w:r>
-        <w:rPr>
-          <w:sz w:val="22"/>
-          <w:szCs w:val="22"/>
-        </w:rPr>
-        <w:t xml:space="preserve">Moritz, C., Vii, J., Long, W., Tamelander, J., Thomassin, A., &amp; Planes, S. (2017). Status and trends of coral reefs of the Pacific. Global Coral Reef Monitoring Network.</w:t>
-      </w:r>
-    </w:p>
-    <w:p>
-      <w:pPr>
-        <w:spacing w:before="0" w:after="0"/>
-      </w:pPr>
-    </w:p>
-    <w:p>
-      <w:pPr>
-        <w:ind w:left="720"/>
-        <w:spacing w:before="0" w:after="80" w:line="360" w:lineRule="auto"/>
-      </w:pPr>
-      <w:r>
-        <w:rPr>
-          <w:sz w:val="22"/>
-          <w:szCs w:val="22"/>
-        </w:rPr>
-        <w:t xml:space="preserve">Nguyen, P. Q., Courchesne, N. M. D., Duraj-Thatte, A., Praveschotinunt, P., &amp; Joshi, N. S. (2018). Engineered living materials: Prospects and challenges for using biological systems to direct the assembly of smart materials. Advanced Materials, 30(19), 1704847. https://doi.org/10.1002/adma.201704847</w:t>
-      </w:r>
-    </w:p>
-    <w:p>
-      <w:pPr>
-        <w:spacing w:before="0" w:after="0"/>
-      </w:pPr>
-    </w:p>
-    <w:p>
-      <w:pPr>
-        <w:ind w:left="720"/>
-        <w:spacing w:before="0" w:after="80" w:line="360" w:lineRule="auto"/>
-      </w:pPr>
-      <w:r>
-        <w:rPr>
-          <w:sz w:val="22"/>
-          <w:szCs w:val="22"/>
-        </w:rPr>
-        <w:t xml:space="preserve">Oxman, N. (2010). Material-based design computation [Doctoral dissertation, Massachusetts Institute of Technology]. MIT Libraries.</w:t>
-      </w:r>
-    </w:p>
-    <w:p>
-      <w:pPr>
-        <w:spacing w:before="0" w:after="0"/>
-      </w:pPr>
-    </w:p>
-    <w:p>
-      <w:pPr>
-        <w:ind w:left="720"/>
-        <w:spacing w:before="0" w:after="80" w:line="360" w:lineRule="auto"/>
-      </w:pPr>
-      <w:r>
-        <w:rPr>
-          <w:sz w:val="22"/>
-          <w:szCs w:val="22"/>
-        </w:rPr>
-        <w:t xml:space="preserve">Reichstein, M., Camps-Valls, G., Stevens, B., Jung, M., Denzler, J., Carvalhais, N., &amp; Prabhat. (2019). Deep learning and process understanding for data-driven Earth system science. Nature, 566(7743), 195–204. https://doi.org/10.1038/s41586-019-0912-1</w:t>
-      </w:r>
-    </w:p>
-    <w:p>
-      <w:pPr>
-        <w:spacing w:before="0" w:after="0"/>
-      </w:pPr>
-    </w:p>
-    <w:p>
-      <w:pPr>
-        <w:ind w:left="720"/>
-        <w:spacing w:before="0" w:after="80" w:line="360" w:lineRule="auto"/>
-      </w:pPr>
-      <w:r>
-        <w:rPr>
-          <w:sz w:val="22"/>
-          <w:szCs w:val="22"/>
-        </w:rPr>
-        <w:t xml:space="preserve">Shea, K., Aish, R., &amp; Gourtovaia, M. (2005). Towards integrated performance-driven generative design tools. Automation in Construction, 14(2), 253–264. https://doi.org/10.1016/j.autcon.2004.07.002</w:t>
-      </w:r>
-    </w:p>
-    <w:p>
-      <w:pPr>
-        <w:spacing w:before="0" w:after="0"/>
-      </w:pPr>
-    </w:p>
-    <w:p>
-      <w:pPr>
-        <w:ind w:left="720"/>
-        <w:spacing w:before="0" w:after="80" w:line="360" w:lineRule="auto"/>
-      </w:pPr>
-      <w:r>
-        <w:rPr>
-          <w:sz w:val="22"/>
-          <w:szCs w:val="22"/>
-        </w:rPr>
-        <w:t xml:space="preserve">Steadman, P. (2008). The evolution of designs: Biological analogy in architecture and the applied arts (Rev. ed.). Routledge.</w:t>
-      </w:r>
-    </w:p>
-    <w:p>
-      <w:pPr>
-        <w:spacing w:before="0" w:after="0"/>
-      </w:pPr>
-    </w:p>
-    <w:p>
-      <w:pPr>
-        <w:ind w:left="720"/>
-        <w:spacing w:before="0" w:after="80" w:line="360" w:lineRule="auto"/>
-      </w:pPr>
-      <w:r>
-        <w:rPr>
-          <w:sz w:val="22"/>
-          <w:szCs w:val="22"/>
-        </w:rPr>
-        <w:t xml:space="preserve">Tengö, M., Brondizio, E. S., Elmqvist, T., Malmer, P., &amp; Spierenburg, M. (2014). Connecting diverse knowledge systems for enhanced ecosystem governance: The multiple evidence base approach. Ambio, 43(5), 579–591. https://doi.org/10.1007/s13280-014-0501-3</w:t>
-      </w:r>
-    </w:p>
-    <w:p>
-      <w:pPr>
-        <w:spacing w:before="0" w:after="0"/>
-      </w:pPr>
-    </w:p>
-    <w:p>
-      <w:pPr>
-        <w:ind w:left="720"/>
-        <w:spacing w:before="0" w:after="80" w:line="360" w:lineRule="auto"/>
-      </w:pPr>
-      <w:r>
-        <w:rPr>
-          <w:sz w:val="22"/>
-          <w:szCs w:val="22"/>
-        </w:rPr>
-        <w:t xml:space="preserve">Tlostanova, M. (2017). On decolonizing design. Design Philosophy Papers, 15(1), 51–61. https://doi.org/10.1080/14487136.2017.1301017</w:t>
-      </w:r>
-    </w:p>
-    <w:p>
-      <w:pPr>
-        <w:spacing w:before="0" w:after="0"/>
-      </w:pPr>
-    </w:p>
-    <w:p>
-      <w:pPr>
-        <w:ind w:left="720"/>
-        <w:spacing w:before="0" w:after="80" w:line="360" w:lineRule="auto"/>
-      </w:pPr>
-      <w:r>
-        <w:rPr>
-          <w:sz w:val="22"/>
-          <w:szCs w:val="22"/>
-        </w:rPr>
-        <w:t xml:space="preserve">Wilkinson, S., Stoller, P., Ralph, P., Hamdorf, B., Franber, L. N., &amp; Morel, A. (2017). Exploring the feasibility of algae building technology in NSW. Procedia Engineering, 180, 1121–1130. https://doi.org/10.1016/j.proeng.2017.04.272</w:t>
-      </w:r>
-    </w:p>
-    <w:p>
-      <w:pPr>
-        <w:spacing w:before="0" w:after="0"/>
-      </w:pPr>
-    </w:p>
-    <w:p>
-      <w:pPr>
-        <w:ind w:left="720"/>
-        <w:spacing w:before="0" w:after="80" w:line="360" w:lineRule="auto"/>
-      </w:pPr>
-      <w:r>
-        <w:rPr>
-          <w:sz w:val="22"/>
-          <w:szCs w:val="22"/>
-        </w:rPr>
-        <w:t xml:space="preserve">Wise, R. M., Fazey, I., Stafford Smith, M., Park, S. E., Eakin, H. C., Archer Van Garderen, E. R. M., &amp; Campbell, B. (2014). Reconceptualising adaptation to climate change as part of pathways of change and response. Global Environmental Change, 28, 325–336. https://doi.org/10.1016/j.gloenvcha.2013.12.002</w:t>
-      </w:r>
-    </w:p>
-    <w:p>
-      <w:pPr>
-        <w:spacing w:before="0" w:after="0"/>
-      </w:pPr>
-    </w:p>
-    <w:p>
-      <w:pPr>
-        <w:ind w:left="720"/>
-        <w:spacing w:before="0" w:after="80" w:line="360" w:lineRule="auto"/>
-      </w:pPr>
-      <w:r>
-        <w:rPr>
-          <w:sz w:val="22"/>
-          <w:szCs w:val="22"/>
-        </w:rPr>
-        <w:t xml:space="preserve">Yin, R. K. (2018). Case study research and applications: Design and methods (6th ed.). SAGE.</w:t>
+        <w:t xml:space="preserve">, 1(1), 50–61.</w:t>
+      </w:r>
+    </w:p>
+    <w:p>
+      <w:pPr>
+        <w:spacing w:before="0" w:after="0"/>
+      </w:pPr>
+    </w:p>
+    <w:p>
+      <w:pPr>
+        <w:jc w:val="both"/>
+        <w:spacing w:before="0" w:after="120" w:line="360" w:lineRule="auto"/>
+      </w:pPr>
+      <w:r>
+        <w:t xml:space="preserve">[41] Moritz, C., Vii, J., Long, W., Tamelander, J., Thomassin, A., &amp; Planes, S. (2017). </w:t>
+      </w:r>
+      <w:r>
+        <w:rPr>
+          <w:i/>
+          <w:iCs/>
+        </w:rPr>
+        <w:t xml:space="preserve">Status and Trends of Coral Reefs of the Pacific</w:t>
+      </w:r>
+      <w:r>
+        <w:t xml:space="preserve">. Global Coral Reef Monitoring Network.</w:t>
+      </w:r>
+    </w:p>
+    <w:p>
+      <w:pPr>
+        <w:spacing w:before="0" w:after="0"/>
+      </w:pPr>
+    </w:p>
+    <w:p>
+      <w:pPr>
+        <w:jc w:val="both"/>
+        <w:spacing w:before="0" w:after="120" w:line="360" w:lineRule="auto"/>
+      </w:pPr>
+      <w:r>
+        <w:t xml:space="preserve">[42] Hao, M., Qiao, J., Qi, H., &amp; Liu, S. (2022). Microbially induced calcite precipitation for concrete protection—A review. </w:t>
+      </w:r>
+      <w:r>
+        <w:rPr>
+          <w:i/>
+          <w:iCs/>
+        </w:rPr>
+        <w:t xml:space="preserve">Journal of Building Engineering</w:t>
+      </w:r>
+      <w:r>
+        <w:t xml:space="preserve">, 56, 104731.</w:t>
+      </w:r>
+    </w:p>
+    <w:p>
+      <w:pPr>
+        <w:spacing w:before="0" w:after="0"/>
+      </w:pPr>
+    </w:p>
+    <w:p>
+      <w:pPr>
+        <w:jc w:val="both"/>
+        <w:spacing w:before="0" w:after="120" w:line="360" w:lineRule="auto"/>
+      </w:pPr>
+      <w:r>
+        <w:t xml:space="preserve">[43] Bird, R. B., Codding, B. F., Kauhanen, P. G., &amp; Bird, D. W. (2016). Aboriginal hunting buffers climate-driven fire-size variability in Australia's spinifex grasslands. </w:t>
+      </w:r>
+      <w:r>
+        <w:rPr>
+          <w:i/>
+          <w:iCs/>
+        </w:rPr>
+        <w:t xml:space="preserve">Proceedings of the National Academy of Sciences</w:t>
+      </w:r>
+      <w:r>
+        <w:t xml:space="preserve">, 113(38), 10208–10213.</w:t>
+      </w:r>
+    </w:p>
+    <w:p>
+      <w:pPr>
+        <w:spacing w:before="0" w:after="0"/>
+      </w:pPr>
+    </w:p>
+    <w:p>
+      <w:pPr>
+        <w:jc w:val="both"/>
+        <w:spacing w:before="0" w:after="120" w:line="360" w:lineRule="auto"/>
+      </w:pPr>
+      <w:r>
+        <w:t xml:space="preserve">[44] Nguyen, P. Q., Courchesne, N. M. D., Duraj-Thatte, A., Praveschotinunt, P., &amp; Joshi, N. S. (2018). Engineered living materials: Prospects and challenges for using biological systems to direct the assembly of smart materials. </w:t>
+      </w:r>
+      <w:r>
+        <w:rPr>
+          <w:i/>
+          <w:iCs/>
+        </w:rPr>
+        <w:t xml:space="preserve">Advanced Materials</w:t>
+      </w:r>
+      <w:r>
+        <w:t xml:space="preserve">, 30(19), 1704847.</w:t>
+      </w:r>
+    </w:p>
+    <w:p>
+      <w:pPr>
+        <w:spacing w:before="0" w:after="0"/>
+      </w:pPr>
+    </w:p>
+    <w:p>
+      <w:pPr>
+        <w:jc w:val="both"/>
+        <w:spacing w:before="0" w:after="120" w:line="360" w:lineRule="auto"/>
+      </w:pPr>
+      <w:r>
+        <w:t xml:space="preserve">[45] Gilbert, C., &amp; Ellis, T. (2019). Biological engineered living materials: Growing functional materials with genetically programmable properties. </w:t>
+      </w:r>
+      <w:r>
+        <w:rPr>
+          <w:i/>
+          <w:iCs/>
+        </w:rPr>
+        <w:t xml:space="preserve">ACS Synthetic Biology</w:t>
+      </w:r>
+      <w:r>
+        <w:t xml:space="preserve">, 8(1), 1–15.</w:t>
+      </w:r>
+    </w:p>
+    <w:p>
+      <w:pPr>
+        <w:spacing w:before="0" w:after="0"/>
+      </w:pPr>
+    </w:p>
+    <w:p>
+      <w:pPr>
+        <w:jc w:val="both"/>
+        <w:spacing w:before="0" w:after="120" w:line="360" w:lineRule="auto"/>
+      </w:pPr>
+      <w:r>
+        <w:t xml:space="preserve">[46] Wise, R. M., Fazey, I., Stafford Smith, M., Park, S. E., Eakin, H. C., Archer Van Garderen, E. R. M., &amp; Campbell, B. (2014). Reconceptualising adaptation to climate change as part of pathways of change and response. </w:t>
+      </w:r>
+      <w:r>
+        <w:rPr>
+          <w:i/>
+          <w:iCs/>
+        </w:rPr>
+        <w:t xml:space="preserve">Global Environmental Change</w:t>
+      </w:r>
+      <w:r>
+        <w:t xml:space="preserve">, 28, 325–336.</w:t>
       </w:r>
     </w:p>
     <w:p>

</xml_diff>